<commit_message>
docs: sincronizar informe final con la version editada en Word
</commit_message>
<xml_diff>
--- a/docs/Primer_Avance_Proyecto_Final.docx
+++ b/docs/Primer_Avance_Proyecto_Final.docx
@@ -379,7 +379,7 @@
           <w:sz w:val="24"/>
           <w:szCs w:val="24"/>
         </w:rPr>
-        <w:t xml:space="preserve">ejarano </w:t>
+        <w:t>ejarano A</w:t>
       </w:r>
       <w:r>
         <w:rPr>
@@ -388,28 +388,25 @@
           <w:sz w:val="24"/>
           <w:szCs w:val="24"/>
         </w:rPr>
-        <w:t>A</w:t>
-      </w:r>
-      <w:r>
+        <w:t>renas</w:t>
+      </w:r>
+    </w:p>
+    <w:p>
+      <w:pPr>
+        <w:spacing w:after="40"/>
+        <w:jc w:val="center"/>
         <w:rPr>
           <w:b/>
           <w:bCs/>
           <w:sz w:val="24"/>
           <w:szCs w:val="24"/>
         </w:rPr>
-        <w:t>renas</w:t>
-      </w:r>
+      </w:pPr>
     </w:p>
     <w:p>
       <w:pPr>
         <w:spacing w:after="40"/>
         <w:jc w:val="center"/>
-        <w:rPr>
-          <w:b/>
-          <w:bCs/>
-          <w:sz w:val="24"/>
-          <w:szCs w:val="24"/>
-        </w:rPr>
       </w:pPr>
     </w:p>
     <w:p>
@@ -422,99 +419,60 @@
       <w:pPr>
         <w:spacing w:after="40"/>
         <w:jc w:val="center"/>
-        <w:rPr>
-          <w:lang w:val="en-US"/>
-        </w:rPr>
       </w:pPr>
     </w:p>
     <w:p>
       <w:pPr>
         <w:spacing w:after="40"/>
         <w:jc w:val="center"/>
-        <w:rPr>
-          <w:lang w:val="en-US"/>
-        </w:rPr>
       </w:pPr>
     </w:p>
     <w:p>
       <w:pPr>
         <w:spacing w:after="40"/>
         <w:jc w:val="center"/>
-        <w:rPr>
-          <w:lang w:val="en-US"/>
-        </w:rPr>
       </w:pPr>
     </w:p>
     <w:p>
       <w:pPr>
         <w:spacing w:after="40"/>
         <w:jc w:val="center"/>
-        <w:rPr>
-          <w:lang w:val="en-US"/>
-        </w:rPr>
       </w:pPr>
     </w:p>
     <w:p>
       <w:pPr>
         <w:spacing w:after="40"/>
         <w:jc w:val="center"/>
-        <w:rPr>
-          <w:lang w:val="en-US"/>
-        </w:rPr>
       </w:pPr>
     </w:p>
     <w:p>
       <w:pPr>
         <w:spacing w:after="40"/>
         <w:jc w:val="center"/>
-        <w:rPr>
-          <w:lang w:val="en-US"/>
-        </w:rPr>
       </w:pPr>
     </w:p>
     <w:p>
       <w:pPr>
         <w:spacing w:after="40"/>
         <w:jc w:val="center"/>
-        <w:rPr>
-          <w:lang w:val="en-US"/>
-        </w:rPr>
       </w:pPr>
     </w:p>
     <w:p>
       <w:pPr>
         <w:spacing w:after="40"/>
         <w:jc w:val="center"/>
-        <w:rPr>
-          <w:lang w:val="en-US"/>
-        </w:rPr>
       </w:pPr>
     </w:p>
     <w:p>
       <w:pPr>
         <w:spacing w:after="40"/>
         <w:jc w:val="center"/>
-        <w:rPr>
-          <w:lang w:val="en-US"/>
-        </w:rPr>
       </w:pPr>
     </w:p>
     <w:p>
       <w:pPr>
         <w:spacing w:after="40"/>
         <w:jc w:val="center"/>
-        <w:rPr>
-          <w:lang w:val="en-US"/>
-        </w:rPr>
-      </w:pPr>
-    </w:p>
-    <w:p>
-      <w:pPr>
-        <w:spacing w:after="40"/>
-        <w:jc w:val="center"/>
-        <w:rPr>
-          <w:lang w:val="en-US"/>
-        </w:rPr>
       </w:pPr>
     </w:p>
     <w:p>
@@ -527,7 +485,6 @@
           <w:bCs/>
           <w:sz w:val="80"/>
           <w:szCs w:val="80"/>
-          <w:lang w:val="en-US"/>
         </w:rPr>
       </w:pPr>
       <w:r>
@@ -537,7 +494,6 @@
           <w:bCs/>
           <w:sz w:val="80"/>
           <w:szCs w:val="80"/>
-          <w:lang w:val="en-US"/>
         </w:rPr>
         <w:t>2026</w:t>
       </w:r>
@@ -546,9 +502,6 @@
       <w:pPr>
         <w:spacing w:after="40"/>
         <w:jc w:val="center"/>
-        <w:rPr>
-          <w:lang w:val="en-US"/>
-        </w:rPr>
       </w:pPr>
     </w:p>
     <w:p>
@@ -832,7 +785,37 @@
           <w:rFonts w:cs="Arial"/>
           <w:lang w:val="es-PE"/>
         </w:rPr>
-        <w:t>/pedidos/pedidos.py), incluyendo una validación (</w:t>
+        <w:t>/pedidos/pedidos.py</w:t>
+      </w:r>
+      <w:proofErr w:type="gramStart"/>
+      <w:r>
+        <w:rPr>
+          <w:rFonts w:cs="Arial"/>
+          <w:lang w:val="es-PE"/>
+        </w:rPr>
+        <w:t xml:space="preserve">), </w:t>
+      </w:r>
+      <w:r>
+        <w:rPr>
+          <w:rFonts w:cs="Arial"/>
+          <w:lang w:val="es-PE"/>
+        </w:rPr>
+        <w:t xml:space="preserve"> </w:t>
+      </w:r>
+      <w:r>
+        <w:rPr>
+          <w:rFonts w:cs="Arial"/>
+          <w:lang w:val="es-PE"/>
+        </w:rPr>
+        <w:t>incluyendo</w:t>
+      </w:r>
+      <w:proofErr w:type="gramEnd"/>
+      <w:r>
+        <w:rPr>
+          <w:rFonts w:cs="Arial"/>
+          <w:lang w:val="es-PE"/>
+        </w:rPr>
+        <w:t xml:space="preserve"> una validación (</w:t>
       </w:r>
       <w:proofErr w:type="spellStart"/>
       <w:r>
@@ -1104,6 +1087,141 @@
     </w:p>
     <w:p>
       <w:pPr>
+        <w:rPr>
+          <w:rFonts w:ascii="Arial" w:hAnsi="Arial" w:cs="Arial"/>
+          <w:sz w:val="22"/>
+          <w:szCs w:val="22"/>
+        </w:rPr>
+      </w:pPr>
+    </w:p>
+    <w:p>
+      <w:pPr>
+        <w:rPr>
+          <w:rFonts w:ascii="Arial" w:hAnsi="Arial" w:cs="Arial"/>
+          <w:sz w:val="22"/>
+          <w:szCs w:val="22"/>
+        </w:rPr>
+      </w:pPr>
+    </w:p>
+    <w:p>
+      <w:pPr>
+        <w:rPr>
+          <w:rFonts w:ascii="Arial" w:hAnsi="Arial" w:cs="Arial"/>
+          <w:sz w:val="22"/>
+          <w:szCs w:val="22"/>
+        </w:rPr>
+      </w:pPr>
+    </w:p>
+    <w:p>
+      <w:pPr>
+        <w:rPr>
+          <w:rFonts w:ascii="Arial" w:hAnsi="Arial" w:cs="Arial"/>
+          <w:sz w:val="22"/>
+          <w:szCs w:val="22"/>
+        </w:rPr>
+      </w:pPr>
+    </w:p>
+    <w:p>
+      <w:pPr>
+        <w:rPr>
+          <w:rFonts w:ascii="Arial" w:hAnsi="Arial" w:cs="Arial"/>
+          <w:sz w:val="22"/>
+          <w:szCs w:val="22"/>
+        </w:rPr>
+      </w:pPr>
+    </w:p>
+    <w:p>
+      <w:pPr>
+        <w:rPr>
+          <w:rFonts w:ascii="Arial" w:hAnsi="Arial" w:cs="Arial"/>
+          <w:sz w:val="22"/>
+          <w:szCs w:val="22"/>
+        </w:rPr>
+      </w:pPr>
+    </w:p>
+    <w:p>
+      <w:pPr>
+        <w:rPr>
+          <w:rFonts w:ascii="Arial" w:hAnsi="Arial" w:cs="Arial"/>
+          <w:sz w:val="22"/>
+          <w:szCs w:val="22"/>
+        </w:rPr>
+      </w:pPr>
+    </w:p>
+    <w:p>
+      <w:pPr>
+        <w:rPr>
+          <w:rFonts w:ascii="Arial" w:hAnsi="Arial" w:cs="Arial"/>
+          <w:sz w:val="22"/>
+          <w:szCs w:val="22"/>
+        </w:rPr>
+      </w:pPr>
+    </w:p>
+    <w:p>
+      <w:pPr>
+        <w:rPr>
+          <w:rFonts w:ascii="Arial" w:hAnsi="Arial" w:cs="Arial"/>
+          <w:sz w:val="22"/>
+          <w:szCs w:val="22"/>
+        </w:rPr>
+      </w:pPr>
+    </w:p>
+    <w:p>
+      <w:pPr>
+        <w:rPr>
+          <w:rFonts w:ascii="Arial" w:hAnsi="Arial" w:cs="Arial"/>
+          <w:sz w:val="22"/>
+          <w:szCs w:val="22"/>
+        </w:rPr>
+      </w:pPr>
+    </w:p>
+    <w:p>
+      <w:pPr>
+        <w:rPr>
+          <w:rFonts w:ascii="Arial" w:hAnsi="Arial" w:cs="Arial"/>
+          <w:sz w:val="22"/>
+          <w:szCs w:val="22"/>
+        </w:rPr>
+      </w:pPr>
+    </w:p>
+    <w:p>
+      <w:pPr>
+        <w:rPr>
+          <w:rFonts w:ascii="Arial" w:hAnsi="Arial" w:cs="Arial"/>
+          <w:sz w:val="22"/>
+          <w:szCs w:val="22"/>
+        </w:rPr>
+      </w:pPr>
+    </w:p>
+    <w:p>
+      <w:pPr>
+        <w:rPr>
+          <w:rFonts w:ascii="Arial" w:hAnsi="Arial" w:cs="Arial"/>
+          <w:sz w:val="22"/>
+          <w:szCs w:val="22"/>
+        </w:rPr>
+      </w:pPr>
+    </w:p>
+    <w:p>
+      <w:pPr>
+        <w:rPr>
+          <w:rFonts w:ascii="Arial" w:hAnsi="Arial" w:cs="Arial"/>
+          <w:sz w:val="22"/>
+          <w:szCs w:val="22"/>
+        </w:rPr>
+      </w:pPr>
+    </w:p>
+    <w:p>
+      <w:pPr>
+        <w:rPr>
+          <w:rFonts w:ascii="Arial" w:hAnsi="Arial" w:cs="Arial"/>
+          <w:sz w:val="22"/>
+          <w:szCs w:val="22"/>
+        </w:rPr>
+      </w:pPr>
+    </w:p>
+    <w:p>
+      <w:pPr>
         <w:pStyle w:val="Ttulo1"/>
       </w:pPr>
       <w:r>
@@ -1119,7 +1237,6 @@
       </w:r>
     </w:p>
     <w:p>
-      <w:pPr/>
       <w:r>
         <w:rPr>
           <w:rFonts w:ascii="Arial" w:hAnsi="Arial" w:cs="Arial"/>
@@ -1146,6 +1263,9 @@
     <w:p>
       <w:pPr>
         <w:pStyle w:val="Listaconvietas"/>
+        <w:rPr>
+          <w:lang w:val="es-PE"/>
+        </w:rPr>
       </w:pPr>
       <w:r>
         <w:rPr>
@@ -1158,14 +1278,42 @@
     <w:p>
       <w:pPr>
         <w:pStyle w:val="Listaconvietas"/>
-      </w:pPr>
-      <w:r>
-        <w:rPr>
-          <w:rFonts w:cs="Arial"/>
-          <w:lang w:val="es-PE"/>
-        </w:rPr>
-        <w:t>Se verificó la instalación ejecutando: git --version</w:t>
-      </w:r>
+        <w:rPr>
+          <w:lang w:val="es-PE"/>
+        </w:rPr>
+      </w:pPr>
+      <w:r>
+        <w:rPr>
+          <w:rFonts w:cs="Arial"/>
+          <w:lang w:val="es-PE"/>
+        </w:rPr>
+        <w:t xml:space="preserve">Se verificó la instalación ejecutando: </w:t>
+      </w:r>
+      <w:proofErr w:type="spellStart"/>
+      <w:r>
+        <w:rPr>
+          <w:rFonts w:cs="Arial"/>
+          <w:lang w:val="es-PE"/>
+        </w:rPr>
+        <w:t>git</w:t>
+      </w:r>
+      <w:proofErr w:type="spellEnd"/>
+      <w:r>
+        <w:rPr>
+          <w:rFonts w:cs="Arial"/>
+          <w:lang w:val="es-PE"/>
+        </w:rPr>
+        <w:t xml:space="preserve"> --</w:t>
+      </w:r>
+      <w:proofErr w:type="spellStart"/>
+      <w:r>
+        <w:rPr>
+          <w:rFonts w:cs="Arial"/>
+          <w:lang w:val="es-PE"/>
+        </w:rPr>
+        <w:t>version</w:t>
+      </w:r>
+      <w:proofErr w:type="spellEnd"/>
     </w:p>
     <w:p>
       <w:pPr>
@@ -1184,37 +1332,181 @@
     <w:p>
       <w:pPr>
         <w:pStyle w:val="Listaconvietas"/>
-      </w:pPr>
-      <w:r>
-        <w:rPr>
-          <w:rFonts w:cs="Arial"/>
-          <w:lang w:val="es-PE"/>
-        </w:rPr>
-        <w:t>git config --global user.name "Nombre Apellido"  →  registra el nombre del autor de los commits.</w:t>
+        <w:rPr>
+          <w:lang w:val="es-PE"/>
+        </w:rPr>
+      </w:pPr>
+      <w:r>
+        <w:rPr>
+          <w:rFonts w:cs="Arial"/>
+          <w:lang w:val="es-PE"/>
+        </w:rPr>
+        <w:t>git config --global user.name "Nombre Apellido"</w:t>
+      </w:r>
+      <w:r>
+        <w:rPr>
+          <w:rFonts w:cs="Arial"/>
+          <w:lang w:val="es-PE"/>
+        </w:rPr>
+        <w:t>:</w:t>
+      </w:r>
+      <w:r>
+        <w:rPr>
+          <w:rFonts w:cs="Arial"/>
+          <w:lang w:val="es-PE"/>
+        </w:rPr>
+        <w:t xml:space="preserve">  registra el nombre del autor de los </w:t>
+      </w:r>
+      <w:proofErr w:type="spellStart"/>
+      <w:r>
+        <w:rPr>
+          <w:rFonts w:cs="Arial"/>
+          <w:lang w:val="es-PE"/>
+        </w:rPr>
+        <w:t>commits</w:t>
+      </w:r>
+      <w:proofErr w:type="spellEnd"/>
+      <w:r>
+        <w:rPr>
+          <w:rFonts w:cs="Arial"/>
+          <w:lang w:val="es-PE"/>
+        </w:rPr>
+        <w:t>.</w:t>
       </w:r>
     </w:p>
     <w:p>
       <w:pPr>
         <w:pStyle w:val="Listaconvietas"/>
-      </w:pPr>
-      <w:r>
-        <w:rPr>
-          <w:rFonts w:cs="Arial"/>
-          <w:lang w:val="es-PE"/>
-        </w:rPr>
-        <w:t>git config --global user.email "correo@ejemplo.com"  →  registra el correo del autor de los commits.</w:t>
+        <w:rPr>
+          <w:lang w:val="es-PE"/>
+        </w:rPr>
+      </w:pPr>
+      <w:proofErr w:type="spellStart"/>
+      <w:r>
+        <w:rPr>
+          <w:rFonts w:cs="Arial"/>
+          <w:lang w:val="es-PE"/>
+        </w:rPr>
+        <w:t>git</w:t>
+      </w:r>
+      <w:proofErr w:type="spellEnd"/>
+      <w:r>
+        <w:rPr>
+          <w:rFonts w:cs="Arial"/>
+          <w:lang w:val="es-PE"/>
+        </w:rPr>
+        <w:t xml:space="preserve"> </w:t>
+      </w:r>
+      <w:proofErr w:type="spellStart"/>
+      <w:r>
+        <w:rPr>
+          <w:rFonts w:cs="Arial"/>
+          <w:lang w:val="es-PE"/>
+        </w:rPr>
+        <w:t>config</w:t>
+      </w:r>
+      <w:proofErr w:type="spellEnd"/>
+      <w:r>
+        <w:rPr>
+          <w:rFonts w:cs="Arial"/>
+          <w:lang w:val="es-PE"/>
+        </w:rPr>
+        <w:t xml:space="preserve"> --global </w:t>
+      </w:r>
+      <w:proofErr w:type="spellStart"/>
+      <w:proofErr w:type="gramStart"/>
+      <w:r>
+        <w:rPr>
+          <w:rFonts w:cs="Arial"/>
+          <w:lang w:val="es-PE"/>
+        </w:rPr>
+        <w:t>user.email</w:t>
+      </w:r>
+      <w:proofErr w:type="spellEnd"/>
+      <w:proofErr w:type="gramEnd"/>
+      <w:r>
+        <w:rPr>
+          <w:rFonts w:cs="Arial"/>
+          <w:lang w:val="es-PE"/>
+        </w:rPr>
+        <w:t xml:space="preserve"> "correo@ejemplo.com"</w:t>
+      </w:r>
+      <w:r>
+        <w:rPr>
+          <w:rFonts w:cs="Arial"/>
+          <w:lang w:val="es-PE"/>
+        </w:rPr>
+        <w:t>:</w:t>
+      </w:r>
+      <w:r>
+        <w:rPr>
+          <w:rFonts w:cs="Arial"/>
+          <w:lang w:val="es-PE"/>
+        </w:rPr>
+        <w:t xml:space="preserve">  registra el correo del autor de los </w:t>
+      </w:r>
+      <w:proofErr w:type="spellStart"/>
+      <w:r>
+        <w:rPr>
+          <w:rFonts w:cs="Arial"/>
+          <w:lang w:val="es-PE"/>
+        </w:rPr>
+        <w:t>commits</w:t>
+      </w:r>
+      <w:proofErr w:type="spellEnd"/>
+      <w:r>
+        <w:rPr>
+          <w:rFonts w:cs="Arial"/>
+          <w:lang w:val="es-PE"/>
+        </w:rPr>
+        <w:t>.</w:t>
       </w:r>
     </w:p>
     <w:p>
       <w:pPr>
         <w:pStyle w:val="Listaconvietas"/>
-      </w:pPr>
-      <w:r>
-        <w:rPr>
-          <w:rFonts w:cs="Arial"/>
-          <w:lang w:val="es-PE"/>
-        </w:rPr>
-        <w:t>git init  →  inicializó el repositorio local del proyecto.</w:t>
+        <w:rPr>
+          <w:lang w:val="es-PE"/>
+        </w:rPr>
+      </w:pPr>
+      <w:proofErr w:type="spellStart"/>
+      <w:r>
+        <w:rPr>
+          <w:rFonts w:cs="Arial"/>
+          <w:lang w:val="es-PE"/>
+        </w:rPr>
+        <w:t>git</w:t>
+      </w:r>
+      <w:proofErr w:type="spellEnd"/>
+      <w:r>
+        <w:rPr>
+          <w:rFonts w:cs="Arial"/>
+          <w:lang w:val="es-PE"/>
+        </w:rPr>
+        <w:t xml:space="preserve"> </w:t>
+      </w:r>
+      <w:proofErr w:type="spellStart"/>
+      <w:r>
+        <w:rPr>
+          <w:rFonts w:cs="Arial"/>
+          <w:lang w:val="es-PE"/>
+        </w:rPr>
+        <w:t>init</w:t>
+      </w:r>
+      <w:proofErr w:type="spellEnd"/>
+      <w:r>
+        <w:rPr>
+          <w:rFonts w:cs="Arial"/>
+          <w:lang w:val="es-PE"/>
+        </w:rPr>
+        <w:t>:</w:t>
+      </w:r>
+      <w:r>
+        <w:rPr>
+          <w:rFonts w:cs="Arial"/>
+          <w:lang w:val="es-PE"/>
+        </w:rPr>
+        <w:t xml:space="preserve">  inicializó el repositorio local del proyecto.</w:t>
       </w:r>
     </w:p>
     <w:p>
@@ -1234,73 +1526,290 @@
     <w:p>
       <w:pPr>
         <w:pStyle w:val="Listaconvietas"/>
-      </w:pPr>
-      <w:r>
-        <w:rPr>
-          <w:rFonts w:cs="Arial"/>
-          <w:lang w:val="es-PE"/>
-        </w:rPr>
-        <w:t>git status — revisar el estado de los archivos modificados o pendientes de confirmar.</w:t>
+        <w:rPr>
+          <w:lang w:val="es-PE"/>
+        </w:rPr>
+      </w:pPr>
+      <w:proofErr w:type="spellStart"/>
+      <w:r>
+        <w:rPr>
+          <w:rFonts w:cs="Arial"/>
+          <w:lang w:val="es-PE"/>
+        </w:rPr>
+        <w:t>git</w:t>
+      </w:r>
+      <w:proofErr w:type="spellEnd"/>
+      <w:r>
+        <w:rPr>
+          <w:rFonts w:cs="Arial"/>
+          <w:lang w:val="es-PE"/>
+        </w:rPr>
+        <w:t xml:space="preserve"> </w:t>
+      </w:r>
+      <w:proofErr w:type="gramStart"/>
+      <w:r>
+        <w:rPr>
+          <w:rFonts w:cs="Arial"/>
+          <w:lang w:val="es-PE"/>
+        </w:rPr>
+        <w:t>status</w:t>
+      </w:r>
+      <w:proofErr w:type="gramEnd"/>
+      <w:r>
+        <w:rPr>
+          <w:rFonts w:cs="Arial"/>
+          <w:lang w:val="es-PE"/>
+        </w:rPr>
+        <w:t>:</w:t>
+      </w:r>
+      <w:r>
+        <w:rPr>
+          <w:rFonts w:cs="Arial"/>
+          <w:lang w:val="es-PE"/>
+        </w:rPr>
+        <w:t xml:space="preserve"> revisar el estado de los archivos modificados o pendientes de confirmar.</w:t>
       </w:r>
     </w:p>
     <w:p>
       <w:pPr>
         <w:pStyle w:val="Listaconvietas"/>
-      </w:pPr>
-      <w:r>
-        <w:rPr>
-          <w:rFonts w:cs="Arial"/>
-          <w:lang w:val="es-PE"/>
-        </w:rPr>
-        <w:t>git add — preparar (stage) los archivos antes de confirmarlos.</w:t>
+        <w:rPr>
+          <w:lang w:val="es-PE"/>
+        </w:rPr>
+      </w:pPr>
+      <w:proofErr w:type="spellStart"/>
+      <w:r>
+        <w:rPr>
+          <w:rFonts w:cs="Arial"/>
+          <w:lang w:val="es-PE"/>
+        </w:rPr>
+        <w:t>git</w:t>
+      </w:r>
+      <w:proofErr w:type="spellEnd"/>
+      <w:r>
+        <w:rPr>
+          <w:rFonts w:cs="Arial"/>
+          <w:lang w:val="es-PE"/>
+        </w:rPr>
+        <w:t xml:space="preserve"> </w:t>
+      </w:r>
+      <w:proofErr w:type="spellStart"/>
+      <w:r>
+        <w:rPr>
+          <w:rFonts w:cs="Arial"/>
+          <w:lang w:val="es-PE"/>
+        </w:rPr>
+        <w:t>add</w:t>
+      </w:r>
+      <w:proofErr w:type="spellEnd"/>
+      <w:r>
+        <w:rPr>
+          <w:rFonts w:cs="Arial"/>
+          <w:lang w:val="es-PE"/>
+        </w:rPr>
+        <w:t>:</w:t>
+      </w:r>
+      <w:r>
+        <w:rPr>
+          <w:rFonts w:cs="Arial"/>
+          <w:lang w:val="es-PE"/>
+        </w:rPr>
+        <w:t xml:space="preserve"> preparar (</w:t>
+      </w:r>
+      <w:proofErr w:type="spellStart"/>
+      <w:r>
+        <w:rPr>
+          <w:rFonts w:cs="Arial"/>
+          <w:lang w:val="es-PE"/>
+        </w:rPr>
+        <w:t>stage</w:t>
+      </w:r>
+      <w:proofErr w:type="spellEnd"/>
+      <w:r>
+        <w:rPr>
+          <w:rFonts w:cs="Arial"/>
+          <w:lang w:val="es-PE"/>
+        </w:rPr>
+        <w:t>) los archivos antes de confirmarlos.</w:t>
       </w:r>
     </w:p>
     <w:p>
       <w:pPr>
         <w:pStyle w:val="Listaconvietas"/>
-      </w:pPr>
-      <w:r>
-        <w:rPr>
-          <w:rFonts w:cs="Arial"/>
-          <w:lang w:val="es-PE"/>
-        </w:rPr>
-        <w:t>git commit — registrar los cambios junto con un mensaje descriptivo.</w:t>
+        <w:rPr>
+          <w:lang w:val="es-PE"/>
+        </w:rPr>
+      </w:pPr>
+      <w:proofErr w:type="spellStart"/>
+      <w:r>
+        <w:rPr>
+          <w:rFonts w:cs="Arial"/>
+          <w:lang w:val="es-PE"/>
+        </w:rPr>
+        <w:t>git</w:t>
+      </w:r>
+      <w:proofErr w:type="spellEnd"/>
+      <w:r>
+        <w:rPr>
+          <w:rFonts w:cs="Arial"/>
+          <w:lang w:val="es-PE"/>
+        </w:rPr>
+        <w:t xml:space="preserve"> </w:t>
+      </w:r>
+      <w:proofErr w:type="spellStart"/>
+      <w:r>
+        <w:rPr>
+          <w:rFonts w:cs="Arial"/>
+          <w:lang w:val="es-PE"/>
+        </w:rPr>
+        <w:t>commit</w:t>
+      </w:r>
+      <w:proofErr w:type="spellEnd"/>
+      <w:r>
+        <w:rPr>
+          <w:rFonts w:cs="Arial"/>
+          <w:lang w:val="es-PE"/>
+        </w:rPr>
+        <w:t>:</w:t>
+      </w:r>
+      <w:r>
+        <w:rPr>
+          <w:rFonts w:cs="Arial"/>
+          <w:lang w:val="es-PE"/>
+        </w:rPr>
+        <w:t xml:space="preserve"> registrar los cambios junto con un mensaje descriptivo.</w:t>
       </w:r>
     </w:p>
     <w:p>
       <w:pPr>
         <w:pStyle w:val="Listaconvietas"/>
-      </w:pPr>
-      <w:r>
-        <w:rPr>
-          <w:rFonts w:cs="Arial"/>
-          <w:lang w:val="es-PE"/>
-        </w:rPr>
-        <w:t>git remote — vincular el repositorio local con el repositorio remoto en GitHub.</w:t>
+        <w:rPr>
+          <w:lang w:val="es-PE"/>
+        </w:rPr>
+      </w:pPr>
+      <w:proofErr w:type="spellStart"/>
+      <w:r>
+        <w:rPr>
+          <w:rFonts w:cs="Arial"/>
+          <w:lang w:val="es-PE"/>
+        </w:rPr>
+        <w:t>git</w:t>
+      </w:r>
+      <w:proofErr w:type="spellEnd"/>
+      <w:r>
+        <w:rPr>
+          <w:rFonts w:cs="Arial"/>
+          <w:lang w:val="es-PE"/>
+        </w:rPr>
+        <w:t xml:space="preserve"> remote</w:t>
+      </w:r>
+      <w:r>
+        <w:rPr>
+          <w:rFonts w:cs="Arial"/>
+          <w:lang w:val="es-PE"/>
+        </w:rPr>
+        <w:t>:</w:t>
+      </w:r>
+      <w:r>
+        <w:rPr>
+          <w:rFonts w:cs="Arial"/>
+          <w:lang w:val="es-PE"/>
+        </w:rPr>
+        <w:t xml:space="preserve"> vincular el repositorio local con el repositorio remoto en GitHub.</w:t>
       </w:r>
     </w:p>
     <w:p>
       <w:pPr>
         <w:pStyle w:val="Listaconvietas"/>
-      </w:pPr>
-      <w:r>
-        <w:rPr>
-          <w:rFonts w:cs="Arial"/>
-          <w:lang w:val="es-PE"/>
-        </w:rPr>
-        <w:t>git push — subir los cambios confirmados al repositorio remoto.</w:t>
+        <w:rPr>
+          <w:lang w:val="es-PE"/>
+        </w:rPr>
+      </w:pPr>
+      <w:proofErr w:type="spellStart"/>
+      <w:r>
+        <w:rPr>
+          <w:rFonts w:cs="Arial"/>
+          <w:lang w:val="es-PE"/>
+        </w:rPr>
+        <w:t>git</w:t>
+      </w:r>
+      <w:proofErr w:type="spellEnd"/>
+      <w:r>
+        <w:rPr>
+          <w:rFonts w:cs="Arial"/>
+          <w:lang w:val="es-PE"/>
+        </w:rPr>
+        <w:t xml:space="preserve"> </w:t>
+      </w:r>
+      <w:proofErr w:type="spellStart"/>
+      <w:r>
+        <w:rPr>
+          <w:rFonts w:cs="Arial"/>
+          <w:lang w:val="es-PE"/>
+        </w:rPr>
+        <w:t>push</w:t>
+      </w:r>
+      <w:proofErr w:type="spellEnd"/>
+      <w:r>
+        <w:rPr>
+          <w:rFonts w:cs="Arial"/>
+          <w:lang w:val="es-PE"/>
+        </w:rPr>
+        <w:t>:</w:t>
+      </w:r>
+      <w:r>
+        <w:rPr>
+          <w:rFonts w:cs="Arial"/>
+          <w:lang w:val="es-PE"/>
+        </w:rPr>
+        <w:t xml:space="preserve"> subir los cambios confirmados al repositorio remoto.</w:t>
       </w:r>
     </w:p>
     <w:p>
       <w:pPr>
         <w:pStyle w:val="Listaconvietas"/>
-      </w:pPr>
-      <w:r>
-        <w:rPr>
-          <w:rFonts w:cs="Arial"/>
-          <w:lang w:val="es-PE"/>
-        </w:rPr>
-        <w:t>git pull — descargar e integrar los cambios existentes en el repositorio remoto.</w:t>
+        <w:rPr>
+          <w:lang w:val="es-PE"/>
+        </w:rPr>
+      </w:pPr>
+      <w:proofErr w:type="spellStart"/>
+      <w:r>
+        <w:rPr>
+          <w:rFonts w:cs="Arial"/>
+          <w:lang w:val="es-PE"/>
+        </w:rPr>
+        <w:t>git</w:t>
+      </w:r>
+      <w:proofErr w:type="spellEnd"/>
+      <w:r>
+        <w:rPr>
+          <w:rFonts w:cs="Arial"/>
+          <w:lang w:val="es-PE"/>
+        </w:rPr>
+        <w:t xml:space="preserve"> </w:t>
+      </w:r>
+      <w:proofErr w:type="spellStart"/>
+      <w:r>
+        <w:rPr>
+          <w:rFonts w:cs="Arial"/>
+          <w:lang w:val="es-PE"/>
+        </w:rPr>
+        <w:t>pull</w:t>
+      </w:r>
+      <w:proofErr w:type="spellEnd"/>
+      <w:r>
+        <w:rPr>
+          <w:rFonts w:cs="Arial"/>
+          <w:lang w:val="es-PE"/>
+        </w:rPr>
+        <w:t>:</w:t>
+      </w:r>
+      <w:r>
+        <w:rPr>
+          <w:rFonts w:cs="Arial"/>
+          <w:lang w:val="es-PE"/>
+        </w:rPr>
+        <w:t xml:space="preserve"> descargar e integrar los cambios existentes en el repositorio remoto.</w:t>
       </w:r>
     </w:p>
     <w:p>
@@ -1320,7 +1829,6 @@
       </w:r>
     </w:p>
     <w:p>
-      <w:pPr/>
       <w:r>
         <w:rPr>
           <w:rFonts w:ascii="Arial" w:hAnsi="Arial" w:cs="Arial"/>
@@ -1333,6 +1841,9 @@
     <w:p>
       <w:pPr>
         <w:pStyle w:val="Listaconvietas"/>
+        <w:rPr>
+          <w:lang w:val="es-PE"/>
+        </w:rPr>
       </w:pPr>
       <w:r>
         <w:rPr>
@@ -1345,37 +1856,238 @@
     <w:p>
       <w:pPr>
         <w:pStyle w:val="Listaconvietas"/>
-      </w:pPr>
-      <w:r>
-        <w:rPr>
-          <w:rFonts w:cs="Arial"/>
-          <w:lang w:val="es-PE"/>
-        </w:rPr>
-        <w:t>Se vinculó el repositorio local con el remoto mediante: git remote add origin https://github.com/U23208480/proyecto-pedidos-equipo01.git</w:t>
+        <w:rPr>
+          <w:lang w:val="es-PE"/>
+        </w:rPr>
+      </w:pPr>
+      <w:r>
+        <w:rPr>
+          <w:rFonts w:cs="Arial"/>
+          <w:lang w:val="es-PE"/>
+        </w:rPr>
+        <w:t xml:space="preserve">Se vinculó el repositorio local con el remoto mediante: git remote </w:t>
+      </w:r>
+      <w:proofErr w:type="spellStart"/>
+      <w:r>
+        <w:rPr>
+          <w:rFonts w:cs="Arial"/>
+          <w:lang w:val="es-PE"/>
+        </w:rPr>
+        <w:t>add</w:t>
+      </w:r>
+      <w:proofErr w:type="spellEnd"/>
+      <w:r>
+        <w:rPr>
+          <w:rFonts w:cs="Arial"/>
+          <w:lang w:val="es-PE"/>
+        </w:rPr>
+        <w:t xml:space="preserve"> </w:t>
+      </w:r>
+      <w:proofErr w:type="spellStart"/>
+      <w:r>
+        <w:rPr>
+          <w:rFonts w:cs="Arial"/>
+          <w:lang w:val="es-PE"/>
+        </w:rPr>
+        <w:t>origin</w:t>
+      </w:r>
+      <w:proofErr w:type="spellEnd"/>
+      <w:r>
+        <w:rPr>
+          <w:rFonts w:cs="Arial"/>
+          <w:lang w:val="es-PE"/>
+        </w:rPr>
+        <w:t xml:space="preserve"> https://github.com/U23208480/proyecto-pedidos-equipo01.git</w:t>
       </w:r>
     </w:p>
     <w:p>
       <w:pPr>
         <w:pStyle w:val="Listaconvietas"/>
-      </w:pPr>
-      <w:r>
-        <w:rPr>
-          <w:rFonts w:cs="Arial"/>
-          <w:lang w:val="es-PE"/>
-        </w:rPr>
-        <w:t>Se subió el historial completo de ramas con: git push -u origin main, seguido de git push origin develop feature/clientes feature/productos feature/pedidos</w:t>
+        <w:rPr>
+          <w:lang w:val="es-PE"/>
+        </w:rPr>
+      </w:pPr>
+      <w:r>
+        <w:rPr>
+          <w:rFonts w:cs="Arial"/>
+          <w:lang w:val="es-PE"/>
+        </w:rPr>
+        <w:t xml:space="preserve">Se subió el historial completo de ramas con: </w:t>
+      </w:r>
+      <w:proofErr w:type="spellStart"/>
+      <w:r>
+        <w:rPr>
+          <w:rFonts w:cs="Arial"/>
+          <w:lang w:val="es-PE"/>
+        </w:rPr>
+        <w:t>git</w:t>
+      </w:r>
+      <w:proofErr w:type="spellEnd"/>
+      <w:r>
+        <w:rPr>
+          <w:rFonts w:cs="Arial"/>
+          <w:lang w:val="es-PE"/>
+        </w:rPr>
+        <w:t xml:space="preserve"> </w:t>
+      </w:r>
+      <w:proofErr w:type="spellStart"/>
+      <w:r>
+        <w:rPr>
+          <w:rFonts w:cs="Arial"/>
+          <w:lang w:val="es-PE"/>
+        </w:rPr>
+        <w:t>push</w:t>
+      </w:r>
+      <w:proofErr w:type="spellEnd"/>
+      <w:r>
+        <w:rPr>
+          <w:rFonts w:cs="Arial"/>
+          <w:lang w:val="es-PE"/>
+        </w:rPr>
+        <w:t xml:space="preserve"> -u </w:t>
+      </w:r>
+      <w:proofErr w:type="spellStart"/>
+      <w:r>
+        <w:rPr>
+          <w:rFonts w:cs="Arial"/>
+          <w:lang w:val="es-PE"/>
+        </w:rPr>
+        <w:t>origin</w:t>
+      </w:r>
+      <w:proofErr w:type="spellEnd"/>
+      <w:r>
+        <w:rPr>
+          <w:rFonts w:cs="Arial"/>
+          <w:lang w:val="es-PE"/>
+        </w:rPr>
+        <w:t xml:space="preserve"> </w:t>
+      </w:r>
+      <w:proofErr w:type="spellStart"/>
+      <w:r>
+        <w:rPr>
+          <w:rFonts w:cs="Arial"/>
+          <w:lang w:val="es-PE"/>
+        </w:rPr>
+        <w:t>main</w:t>
+      </w:r>
+      <w:proofErr w:type="spellEnd"/>
+      <w:r>
+        <w:rPr>
+          <w:rFonts w:cs="Arial"/>
+          <w:lang w:val="es-PE"/>
+        </w:rPr>
+        <w:t xml:space="preserve">, seguido de git push origin </w:t>
+      </w:r>
+      <w:proofErr w:type="spellStart"/>
+      <w:r>
+        <w:rPr>
+          <w:rFonts w:cs="Arial"/>
+          <w:lang w:val="es-PE"/>
+        </w:rPr>
+        <w:t>develop</w:t>
+      </w:r>
+      <w:proofErr w:type="spellEnd"/>
+      <w:r>
+        <w:rPr>
+          <w:rFonts w:cs="Arial"/>
+          <w:lang w:val="es-PE"/>
+        </w:rPr>
+        <w:t xml:space="preserve"> </w:t>
+      </w:r>
+      <w:proofErr w:type="spellStart"/>
+      <w:r>
+        <w:rPr>
+          <w:rFonts w:cs="Arial"/>
+          <w:lang w:val="es-PE"/>
+        </w:rPr>
+        <w:t>feature</w:t>
+      </w:r>
+      <w:proofErr w:type="spellEnd"/>
+      <w:r>
+        <w:rPr>
+          <w:rFonts w:cs="Arial"/>
+          <w:lang w:val="es-PE"/>
+        </w:rPr>
+        <w:t xml:space="preserve">/clientes </w:t>
+      </w:r>
+      <w:proofErr w:type="spellStart"/>
+      <w:r>
+        <w:rPr>
+          <w:rFonts w:cs="Arial"/>
+          <w:lang w:val="es-PE"/>
+        </w:rPr>
+        <w:t>feature</w:t>
+      </w:r>
+      <w:proofErr w:type="spellEnd"/>
+      <w:r>
+        <w:rPr>
+          <w:rFonts w:cs="Arial"/>
+          <w:lang w:val="es-PE"/>
+        </w:rPr>
+        <w:t xml:space="preserve">/productos </w:t>
+      </w:r>
+      <w:proofErr w:type="spellStart"/>
+      <w:r>
+        <w:rPr>
+          <w:rFonts w:cs="Arial"/>
+          <w:lang w:val="es-PE"/>
+        </w:rPr>
+        <w:t>feature</w:t>
+      </w:r>
+      <w:proofErr w:type="spellEnd"/>
+      <w:r>
+        <w:rPr>
+          <w:rFonts w:cs="Arial"/>
+          <w:lang w:val="es-PE"/>
+        </w:rPr>
+        <w:t>/pedidos</w:t>
       </w:r>
     </w:p>
     <w:p>
       <w:pPr>
         <w:pStyle w:val="Listaconvietas"/>
-      </w:pPr>
-      <w:r>
-        <w:rPr>
-          <w:rFonts w:cs="Arial"/>
-          <w:lang w:val="es-PE"/>
-        </w:rPr>
-        <w:t>Se agregó al segundo integrante como colaborador del repositorio (Settings &gt; Collaborators) para habilitar su participación directa mediante clone, push y pull.</w:t>
+        <w:rPr>
+          <w:lang w:val="es-PE"/>
+        </w:rPr>
+      </w:pPr>
+      <w:r>
+        <w:rPr>
+          <w:rFonts w:cs="Arial"/>
+          <w:lang w:val="es-PE"/>
+        </w:rPr>
+        <w:t xml:space="preserve">Se agregó al segundo integrante como colaborador del repositorio (Settings &gt; Collaborators) para habilitar su participación directa mediante clone, </w:t>
+      </w:r>
+      <w:proofErr w:type="spellStart"/>
+      <w:r>
+        <w:rPr>
+          <w:rFonts w:cs="Arial"/>
+          <w:lang w:val="es-PE"/>
+        </w:rPr>
+        <w:t>push</w:t>
+      </w:r>
+      <w:proofErr w:type="spellEnd"/>
+      <w:r>
+        <w:rPr>
+          <w:rFonts w:cs="Arial"/>
+          <w:lang w:val="es-PE"/>
+        </w:rPr>
+        <w:t xml:space="preserve"> y </w:t>
+      </w:r>
+      <w:proofErr w:type="spellStart"/>
+      <w:r>
+        <w:rPr>
+          <w:rFonts w:cs="Arial"/>
+          <w:lang w:val="es-PE"/>
+        </w:rPr>
+        <w:t>pull</w:t>
+      </w:r>
+      <w:proofErr w:type="spellEnd"/>
+      <w:r>
+        <w:rPr>
+          <w:rFonts w:cs="Arial"/>
+          <w:lang w:val="es-PE"/>
+        </w:rPr>
+        <w:t>.</w:t>
       </w:r>
     </w:p>
     <w:p>
@@ -1395,73 +2107,331 @@
     <w:p>
       <w:pPr>
         <w:pStyle w:val="Listaconvietas"/>
-      </w:pPr>
-      <w:r>
-        <w:rPr>
-          <w:rFonts w:cs="Arial"/>
-          <w:lang w:val="es-PE"/>
-        </w:rPr>
-        <w:t>1) Clonar el repositorio remoto en el equipo local (git clone).</w:t>
+        <w:rPr>
+          <w:lang w:val="es-PE"/>
+        </w:rPr>
+      </w:pPr>
+      <w:r>
+        <w:rPr>
+          <w:rFonts w:cs="Arial"/>
+          <w:lang w:val="es-PE"/>
+        </w:rPr>
+        <w:t>1) Clonar el repositorio remoto en el equipo local (</w:t>
+      </w:r>
+      <w:proofErr w:type="spellStart"/>
+      <w:r>
+        <w:rPr>
+          <w:rFonts w:cs="Arial"/>
+          <w:lang w:val="es-PE"/>
+        </w:rPr>
+        <w:t>git</w:t>
+      </w:r>
+      <w:proofErr w:type="spellEnd"/>
+      <w:r>
+        <w:rPr>
+          <w:rFonts w:cs="Arial"/>
+          <w:lang w:val="es-PE"/>
+        </w:rPr>
+        <w:t xml:space="preserve"> clone).</w:t>
       </w:r>
     </w:p>
     <w:p>
       <w:pPr>
         <w:pStyle w:val="Listaconvietas"/>
-      </w:pPr>
-      <w:r>
-        <w:rPr>
-          <w:rFonts w:cs="Arial"/>
-          <w:lang w:val="es-PE"/>
-        </w:rPr>
-        <w:t>2) Crear o actualizar una rama de trabajo (git switch / git pull).</w:t>
+        <w:rPr>
+          <w:lang w:val="es-PE"/>
+        </w:rPr>
+      </w:pPr>
+      <w:r>
+        <w:rPr>
+          <w:rFonts w:cs="Arial"/>
+          <w:lang w:val="es-PE"/>
+        </w:rPr>
+        <w:t xml:space="preserve">2) Crear o actualizar una rama de trabajo (git switch / </w:t>
+      </w:r>
+      <w:proofErr w:type="spellStart"/>
+      <w:r>
+        <w:rPr>
+          <w:rFonts w:cs="Arial"/>
+          <w:lang w:val="es-PE"/>
+        </w:rPr>
+        <w:t>git</w:t>
+      </w:r>
+      <w:proofErr w:type="spellEnd"/>
+      <w:r>
+        <w:rPr>
+          <w:rFonts w:cs="Arial"/>
+          <w:lang w:val="es-PE"/>
+        </w:rPr>
+        <w:t xml:space="preserve"> </w:t>
+      </w:r>
+      <w:proofErr w:type="spellStart"/>
+      <w:r>
+        <w:rPr>
+          <w:rFonts w:cs="Arial"/>
+          <w:lang w:val="es-PE"/>
+        </w:rPr>
+        <w:t>pull</w:t>
+      </w:r>
+      <w:proofErr w:type="spellEnd"/>
+      <w:r>
+        <w:rPr>
+          <w:rFonts w:cs="Arial"/>
+          <w:lang w:val="es-PE"/>
+        </w:rPr>
+        <w:t>).</w:t>
       </w:r>
     </w:p>
     <w:p>
       <w:pPr>
         <w:pStyle w:val="Listaconvietas"/>
-      </w:pPr>
-      <w:r>
-        <w:rPr>
-          <w:rFonts w:cs="Arial"/>
-          <w:lang w:val="es-PE"/>
-        </w:rPr>
-        <w:t>3) Realizar cambios y confirmarlos con commits descriptivos (git add, git commit).</w:t>
+        <w:rPr>
+          <w:lang w:val="es-PE"/>
+        </w:rPr>
+      </w:pPr>
+      <w:r>
+        <w:rPr>
+          <w:rFonts w:cs="Arial"/>
+          <w:lang w:val="es-PE"/>
+        </w:rPr>
+        <w:t>3) Realizar cambios y confirmarlos con commits descriptivos (</w:t>
+      </w:r>
+      <w:proofErr w:type="spellStart"/>
+      <w:r>
+        <w:rPr>
+          <w:rFonts w:cs="Arial"/>
+          <w:lang w:val="es-PE"/>
+        </w:rPr>
+        <w:t>git</w:t>
+      </w:r>
+      <w:proofErr w:type="spellEnd"/>
+      <w:r>
+        <w:rPr>
+          <w:rFonts w:cs="Arial"/>
+          <w:lang w:val="es-PE"/>
+        </w:rPr>
+        <w:t xml:space="preserve"> </w:t>
+      </w:r>
+      <w:proofErr w:type="spellStart"/>
+      <w:r>
+        <w:rPr>
+          <w:rFonts w:cs="Arial"/>
+          <w:lang w:val="es-PE"/>
+        </w:rPr>
+        <w:t>add</w:t>
+      </w:r>
+      <w:proofErr w:type="spellEnd"/>
+      <w:r>
+        <w:rPr>
+          <w:rFonts w:cs="Arial"/>
+          <w:lang w:val="es-PE"/>
+        </w:rPr>
+        <w:t xml:space="preserve">, </w:t>
+      </w:r>
+      <w:proofErr w:type="spellStart"/>
+      <w:r>
+        <w:rPr>
+          <w:rFonts w:cs="Arial"/>
+          <w:lang w:val="es-PE"/>
+        </w:rPr>
+        <w:t>git</w:t>
+      </w:r>
+      <w:proofErr w:type="spellEnd"/>
+      <w:r>
+        <w:rPr>
+          <w:rFonts w:cs="Arial"/>
+          <w:lang w:val="es-PE"/>
+        </w:rPr>
+        <w:t xml:space="preserve"> </w:t>
+      </w:r>
+      <w:proofErr w:type="spellStart"/>
+      <w:r>
+        <w:rPr>
+          <w:rFonts w:cs="Arial"/>
+          <w:lang w:val="es-PE"/>
+        </w:rPr>
+        <w:t>commit</w:t>
+      </w:r>
+      <w:proofErr w:type="spellEnd"/>
+      <w:r>
+        <w:rPr>
+          <w:rFonts w:cs="Arial"/>
+          <w:lang w:val="es-PE"/>
+        </w:rPr>
+        <w:t>).</w:t>
       </w:r>
     </w:p>
     <w:p>
       <w:pPr>
         <w:pStyle w:val="Listaconvietas"/>
-      </w:pPr>
-      <w:r>
-        <w:rPr>
-          <w:rFonts w:cs="Arial"/>
-          <w:lang w:val="es-PE"/>
-        </w:rPr>
-        <w:t>4) Subir la rama al repositorio remoto (git push).</w:t>
+        <w:rPr>
+          <w:lang w:val="es-PE"/>
+        </w:rPr>
+      </w:pPr>
+      <w:r>
+        <w:rPr>
+          <w:rFonts w:cs="Arial"/>
+          <w:lang w:val="es-PE"/>
+        </w:rPr>
+        <w:t>4) Subir la rama al repositorio remoto (</w:t>
+      </w:r>
+      <w:proofErr w:type="spellStart"/>
+      <w:r>
+        <w:rPr>
+          <w:rFonts w:cs="Arial"/>
+          <w:lang w:val="es-PE"/>
+        </w:rPr>
+        <w:t>git</w:t>
+      </w:r>
+      <w:proofErr w:type="spellEnd"/>
+      <w:r>
+        <w:rPr>
+          <w:rFonts w:cs="Arial"/>
+          <w:lang w:val="es-PE"/>
+        </w:rPr>
+        <w:t xml:space="preserve"> </w:t>
+      </w:r>
+      <w:proofErr w:type="spellStart"/>
+      <w:r>
+        <w:rPr>
+          <w:rFonts w:cs="Arial"/>
+          <w:lang w:val="es-PE"/>
+        </w:rPr>
+        <w:t>push</w:t>
+      </w:r>
+      <w:proofErr w:type="spellEnd"/>
+      <w:r>
+        <w:rPr>
+          <w:rFonts w:cs="Arial"/>
+          <w:lang w:val="es-PE"/>
+        </w:rPr>
+        <w:t>).</w:t>
       </w:r>
     </w:p>
     <w:p>
       <w:pPr>
         <w:pStyle w:val="Listaconvietas"/>
-      </w:pPr>
-      <w:r>
-        <w:rPr>
-          <w:rFonts w:cs="Arial"/>
-          <w:lang w:val="es-PE"/>
-        </w:rPr>
-        <w:t>5) Integrar los cambios a develop mediante Pull Request o merge (git merge --no-ff).</w:t>
+        <w:rPr>
+          <w:lang w:val="es-PE"/>
+        </w:rPr>
+      </w:pPr>
+      <w:r>
+        <w:rPr>
+          <w:rFonts w:cs="Arial"/>
+          <w:lang w:val="es-PE"/>
+        </w:rPr>
+        <w:t xml:space="preserve">5) Integrar los cambios a develop mediante Pull Request o </w:t>
+      </w:r>
+      <w:proofErr w:type="spellStart"/>
+      <w:r>
+        <w:rPr>
+          <w:rFonts w:cs="Arial"/>
+          <w:lang w:val="es-PE"/>
+        </w:rPr>
+        <w:t>merge</w:t>
+      </w:r>
+      <w:proofErr w:type="spellEnd"/>
+      <w:r>
+        <w:rPr>
+          <w:rFonts w:cs="Arial"/>
+          <w:lang w:val="es-PE"/>
+        </w:rPr>
+        <w:t xml:space="preserve"> (</w:t>
+      </w:r>
+      <w:proofErr w:type="spellStart"/>
+      <w:r>
+        <w:rPr>
+          <w:rFonts w:cs="Arial"/>
+          <w:lang w:val="es-PE"/>
+        </w:rPr>
+        <w:t>git</w:t>
+      </w:r>
+      <w:proofErr w:type="spellEnd"/>
+      <w:r>
+        <w:rPr>
+          <w:rFonts w:cs="Arial"/>
+          <w:lang w:val="es-PE"/>
+        </w:rPr>
+        <w:t xml:space="preserve"> </w:t>
+      </w:r>
+      <w:proofErr w:type="spellStart"/>
+      <w:r>
+        <w:rPr>
+          <w:rFonts w:cs="Arial"/>
+          <w:lang w:val="es-PE"/>
+        </w:rPr>
+        <w:t>merge</w:t>
+      </w:r>
+      <w:proofErr w:type="spellEnd"/>
+      <w:r>
+        <w:rPr>
+          <w:rFonts w:cs="Arial"/>
+          <w:lang w:val="es-PE"/>
+        </w:rPr>
+        <w:t xml:space="preserve"> --no-</w:t>
+      </w:r>
+      <w:proofErr w:type="spellStart"/>
+      <w:r>
+        <w:rPr>
+          <w:rFonts w:cs="Arial"/>
+          <w:lang w:val="es-PE"/>
+        </w:rPr>
+        <w:t>ff</w:t>
+      </w:r>
+      <w:proofErr w:type="spellEnd"/>
+      <w:r>
+        <w:rPr>
+          <w:rFonts w:cs="Arial"/>
+          <w:lang w:val="es-PE"/>
+        </w:rPr>
+        <w:t>).</w:t>
       </w:r>
     </w:p>
     <w:p>
       <w:pPr>
         <w:pStyle w:val="Listaconvietas"/>
-      </w:pPr>
-      <w:r>
-        <w:rPr>
-          <w:rFonts w:cs="Arial"/>
-          <w:lang w:val="es-PE"/>
-        </w:rPr>
-        <w:t>6) Sincronizar la copia local antes de continuar trabajando (git pull).</w:t>
+        <w:rPr>
+          <w:lang w:val="es-PE"/>
+        </w:rPr>
+      </w:pPr>
+      <w:r>
+        <w:rPr>
+          <w:rFonts w:cs="Arial"/>
+          <w:lang w:val="es-PE"/>
+        </w:rPr>
+        <w:t>6) Sincronizar la copia local antes de continuar trabajando (</w:t>
+      </w:r>
+      <w:proofErr w:type="spellStart"/>
+      <w:r>
+        <w:rPr>
+          <w:rFonts w:cs="Arial"/>
+          <w:lang w:val="es-PE"/>
+        </w:rPr>
+        <w:t>git</w:t>
+      </w:r>
+      <w:proofErr w:type="spellEnd"/>
+      <w:r>
+        <w:rPr>
+          <w:rFonts w:cs="Arial"/>
+          <w:lang w:val="es-PE"/>
+        </w:rPr>
+        <w:t xml:space="preserve"> </w:t>
+      </w:r>
+      <w:proofErr w:type="spellStart"/>
+      <w:r>
+        <w:rPr>
+          <w:rFonts w:cs="Arial"/>
+          <w:lang w:val="es-PE"/>
+        </w:rPr>
+        <w:t>pull</w:t>
+      </w:r>
+      <w:proofErr w:type="spellEnd"/>
+      <w:r>
+        <w:rPr>
+          <w:rFonts w:cs="Arial"/>
+          <w:lang w:val="es-PE"/>
+        </w:rPr>
+        <w:t>).</w:t>
       </w:r>
     </w:p>
     <w:p>
@@ -1528,6 +2498,42 @@
           <w:t>https://github.com/U23208480/proyecto-pedidos-equipo01</w:t>
         </w:r>
       </w:hyperlink>
+    </w:p>
+    <w:p>
+      <w:pPr>
+        <w:rPr>
+          <w:rFonts w:ascii="Arial" w:hAnsi="Arial" w:cs="Arial"/>
+          <w:sz w:val="22"/>
+          <w:szCs w:val="22"/>
+        </w:rPr>
+      </w:pPr>
+    </w:p>
+    <w:p>
+      <w:pPr>
+        <w:rPr>
+          <w:rFonts w:ascii="Arial" w:hAnsi="Arial" w:cs="Arial"/>
+          <w:sz w:val="22"/>
+          <w:szCs w:val="22"/>
+        </w:rPr>
+      </w:pPr>
+    </w:p>
+    <w:p>
+      <w:pPr>
+        <w:rPr>
+          <w:rFonts w:ascii="Arial" w:hAnsi="Arial" w:cs="Arial"/>
+          <w:sz w:val="22"/>
+          <w:szCs w:val="22"/>
+        </w:rPr>
+      </w:pPr>
+    </w:p>
+    <w:p>
+      <w:pPr>
+        <w:rPr>
+          <w:rFonts w:ascii="Arial" w:hAnsi="Arial" w:cs="Arial"/>
+          <w:sz w:val="22"/>
+          <w:szCs w:val="22"/>
+        </w:rPr>
+      </w:pPr>
     </w:p>
     <w:p>
       <w:pPr>
@@ -1740,29 +2746,6 @@
     </w:p>
     <w:p>
       <w:pPr>
-        <w:rPr>
-          <w:rFonts w:ascii="Arial" w:hAnsi="Arial" w:cs="Arial"/>
-        </w:rPr>
-      </w:pPr>
-    </w:p>
-    <w:p>
-      <w:pPr>
-        <w:rPr>
-          <w:rFonts w:ascii="Arial" w:hAnsi="Arial" w:cs="Arial"/>
-        </w:rPr>
-      </w:pPr>
-    </w:p>
-    <w:p>
-      <w:pPr>
-        <w:rPr>
-          <w:rFonts w:ascii="Arial" w:hAnsi="Arial" w:cs="Arial"/>
-          <w:sz w:val="22"/>
-          <w:szCs w:val="22"/>
-        </w:rPr>
-      </w:pPr>
-    </w:p>
-    <w:p>
-      <w:pPr>
         <w:pStyle w:val="Listaconvietas"/>
         <w:rPr>
           <w:rFonts w:cs="Arial"/>
@@ -1979,7 +2962,6 @@
       </w:r>
     </w:p>
     <w:p>
-      <w:pPr/>
       <w:r>
         <w:rPr>
           <w:rFonts w:ascii="Arial" w:hAnsi="Arial" w:cs="Arial"/>
@@ -1992,37 +2974,245 @@
     <w:p>
       <w:pPr>
         <w:pStyle w:val="Listaconvietas"/>
-      </w:pPr>
-      <w:r>
-        <w:rPr>
-          <w:rFonts w:cs="Arial"/>
-          <w:lang w:val="es-PE"/>
-        </w:rPr>
-        <w:t>git merge feature/clientes --no-ff — conserva el historial completo de la rama feature dentro de develop.</w:t>
+        <w:rPr>
+          <w:lang w:val="es-PE"/>
+        </w:rPr>
+      </w:pPr>
+      <w:proofErr w:type="spellStart"/>
+      <w:r>
+        <w:rPr>
+          <w:rFonts w:cs="Arial"/>
+          <w:lang w:val="es-PE"/>
+        </w:rPr>
+        <w:t>git</w:t>
+      </w:r>
+      <w:proofErr w:type="spellEnd"/>
+      <w:r>
+        <w:rPr>
+          <w:rFonts w:cs="Arial"/>
+          <w:lang w:val="es-PE"/>
+        </w:rPr>
+        <w:t xml:space="preserve"> </w:t>
+      </w:r>
+      <w:proofErr w:type="spellStart"/>
+      <w:r>
+        <w:rPr>
+          <w:rFonts w:cs="Arial"/>
+          <w:lang w:val="es-PE"/>
+        </w:rPr>
+        <w:t>merge</w:t>
+      </w:r>
+      <w:proofErr w:type="spellEnd"/>
+      <w:r>
+        <w:rPr>
+          <w:rFonts w:cs="Arial"/>
+          <w:lang w:val="es-PE"/>
+        </w:rPr>
+        <w:t xml:space="preserve"> </w:t>
+      </w:r>
+      <w:proofErr w:type="spellStart"/>
+      <w:r>
+        <w:rPr>
+          <w:rFonts w:cs="Arial"/>
+          <w:lang w:val="es-PE"/>
+        </w:rPr>
+        <w:t>feature</w:t>
+      </w:r>
+      <w:proofErr w:type="spellEnd"/>
+      <w:r>
+        <w:rPr>
+          <w:rFonts w:cs="Arial"/>
+          <w:lang w:val="es-PE"/>
+        </w:rPr>
+        <w:t>/clientes --no-</w:t>
+      </w:r>
+      <w:proofErr w:type="spellStart"/>
+      <w:r>
+        <w:rPr>
+          <w:rFonts w:cs="Arial"/>
+          <w:lang w:val="es-PE"/>
+        </w:rPr>
+        <w:t>ff</w:t>
+      </w:r>
+      <w:proofErr w:type="spellEnd"/>
+      <w:r>
+        <w:rPr>
+          <w:rFonts w:cs="Arial"/>
+          <w:lang w:val="es-PE"/>
+        </w:rPr>
+        <w:t>:</w:t>
+      </w:r>
+      <w:r>
+        <w:rPr>
+          <w:rFonts w:cs="Arial"/>
+          <w:lang w:val="es-PE"/>
+        </w:rPr>
+        <w:t xml:space="preserve"> conserva el historial completo de la rama </w:t>
+      </w:r>
+      <w:proofErr w:type="spellStart"/>
+      <w:r>
+        <w:rPr>
+          <w:rFonts w:cs="Arial"/>
+          <w:lang w:val="es-PE"/>
+        </w:rPr>
+        <w:t>feature</w:t>
+      </w:r>
+      <w:proofErr w:type="spellEnd"/>
+      <w:r>
+        <w:rPr>
+          <w:rFonts w:cs="Arial"/>
+          <w:lang w:val="es-PE"/>
+        </w:rPr>
+        <w:t xml:space="preserve"> dentro de </w:t>
+      </w:r>
+      <w:proofErr w:type="spellStart"/>
+      <w:r>
+        <w:rPr>
+          <w:rFonts w:cs="Arial"/>
+          <w:lang w:val="es-PE"/>
+        </w:rPr>
+        <w:t>develop</w:t>
+      </w:r>
+      <w:proofErr w:type="spellEnd"/>
+      <w:r>
+        <w:rPr>
+          <w:rFonts w:cs="Arial"/>
+          <w:lang w:val="es-PE"/>
+        </w:rPr>
+        <w:t>.</w:t>
       </w:r>
     </w:p>
     <w:p>
       <w:pPr>
         <w:pStyle w:val="Listaconvietas"/>
-      </w:pPr>
-      <w:r>
-        <w:rPr>
-          <w:rFonts w:cs="Arial"/>
-          <w:lang w:val="es-PE"/>
-        </w:rPr>
-        <w:t>git merge develop --no-ff — integra una versión estable de develop en main al cerrar cada ciclo de trabajo.</w:t>
+        <w:rPr>
+          <w:lang w:val="es-PE"/>
+        </w:rPr>
+      </w:pPr>
+      <w:proofErr w:type="spellStart"/>
+      <w:r>
+        <w:rPr>
+          <w:rFonts w:cs="Arial"/>
+          <w:lang w:val="es-PE"/>
+        </w:rPr>
+        <w:t>git</w:t>
+      </w:r>
+      <w:proofErr w:type="spellEnd"/>
+      <w:r>
+        <w:rPr>
+          <w:rFonts w:cs="Arial"/>
+          <w:lang w:val="es-PE"/>
+        </w:rPr>
+        <w:t xml:space="preserve"> </w:t>
+      </w:r>
+      <w:proofErr w:type="spellStart"/>
+      <w:r>
+        <w:rPr>
+          <w:rFonts w:cs="Arial"/>
+          <w:lang w:val="es-PE"/>
+        </w:rPr>
+        <w:t>merge</w:t>
+      </w:r>
+      <w:proofErr w:type="spellEnd"/>
+      <w:r>
+        <w:rPr>
+          <w:rFonts w:cs="Arial"/>
+          <w:lang w:val="es-PE"/>
+        </w:rPr>
+        <w:t xml:space="preserve"> </w:t>
+      </w:r>
+      <w:proofErr w:type="spellStart"/>
+      <w:r>
+        <w:rPr>
+          <w:rFonts w:cs="Arial"/>
+          <w:lang w:val="es-PE"/>
+        </w:rPr>
+        <w:t>develop</w:t>
+      </w:r>
+      <w:proofErr w:type="spellEnd"/>
+      <w:r>
+        <w:rPr>
+          <w:rFonts w:cs="Arial"/>
+          <w:lang w:val="es-PE"/>
+        </w:rPr>
+        <w:t xml:space="preserve"> --no-</w:t>
+      </w:r>
+      <w:proofErr w:type="spellStart"/>
+      <w:r>
+        <w:rPr>
+          <w:rFonts w:cs="Arial"/>
+          <w:lang w:val="es-PE"/>
+        </w:rPr>
+        <w:t>ff</w:t>
+      </w:r>
+      <w:proofErr w:type="spellEnd"/>
+      <w:r>
+        <w:rPr>
+          <w:rFonts w:cs="Arial"/>
+          <w:lang w:val="es-PE"/>
+        </w:rPr>
+        <w:t>:</w:t>
+      </w:r>
+      <w:r>
+        <w:rPr>
+          <w:rFonts w:cs="Arial"/>
+          <w:lang w:val="es-PE"/>
+        </w:rPr>
+        <w:t xml:space="preserve"> integra una versión estable de develop en main al cerrar cada ciclo de trabajo.</w:t>
       </w:r>
     </w:p>
     <w:p>
       <w:pPr>
         <w:pStyle w:val="Listaconvietas"/>
-      </w:pPr>
-      <w:r>
-        <w:rPr>
-          <w:rFonts w:cs="Arial"/>
-          <w:lang w:val="es-PE"/>
-        </w:rPr>
-        <w:t>Ventaja: al usar --no-ff, el comando git log --oneline --graph --all muestra claramente cada punto de bifurcación y fusión, facilitando auditar cuándo y cómo se incorporó cada funcionalidad.</w:t>
+        <w:rPr>
+          <w:lang w:val="es-PE"/>
+        </w:rPr>
+      </w:pPr>
+      <w:r>
+        <w:rPr>
+          <w:rFonts w:cs="Arial"/>
+          <w:lang w:val="es-PE"/>
+        </w:rPr>
+        <w:t>Ventaja: al usar --no-</w:t>
+      </w:r>
+      <w:proofErr w:type="spellStart"/>
+      <w:r>
+        <w:rPr>
+          <w:rFonts w:cs="Arial"/>
+          <w:lang w:val="es-PE"/>
+        </w:rPr>
+        <w:t>ff</w:t>
+      </w:r>
+      <w:proofErr w:type="spellEnd"/>
+      <w:r>
+        <w:rPr>
+          <w:rFonts w:cs="Arial"/>
+          <w:lang w:val="es-PE"/>
+        </w:rPr>
+        <w:t>:</w:t>
+      </w:r>
+      <w:r>
+        <w:rPr>
+          <w:rFonts w:cs="Arial"/>
+          <w:lang w:val="es-PE"/>
+        </w:rPr>
+        <w:t xml:space="preserve"> el comando </w:t>
+      </w:r>
+      <w:proofErr w:type="spellStart"/>
+      <w:r>
+        <w:rPr>
+          <w:rFonts w:cs="Arial"/>
+          <w:lang w:val="es-PE"/>
+        </w:rPr>
+        <w:t>git</w:t>
+      </w:r>
+      <w:proofErr w:type="spellEnd"/>
+      <w:r>
+        <w:rPr>
+          <w:rFonts w:cs="Arial"/>
+          <w:lang w:val="es-PE"/>
+        </w:rPr>
+        <w:t xml:space="preserve"> log --oneline --graph --all muestra claramente cada punto de bifurcación y fusión, facilitando auditar cuándo y cómo se incorporó cada funcionalidad.</w:t>
       </w:r>
     </w:p>
     <w:p>
@@ -2377,7 +3567,7 @@
           <w:sz w:val="22"/>
           <w:szCs w:val="22"/>
         </w:rPr>
-        <w:t>7. Evidencias de los commits realizados</w:t>
+        <w:t xml:space="preserve">7. Evidencias de los </w:t>
       </w:r>
       <w:proofErr w:type="spellStart"/>
       <w:r>
@@ -2389,6 +3579,7 @@
           <w:sz w:val="22"/>
           <w:szCs w:val="22"/>
         </w:rPr>
+        <w:t>commits</w:t>
       </w:r>
       <w:proofErr w:type="spellEnd"/>
       <w:r>
@@ -2400,6 +3591,7 @@
           <w:sz w:val="22"/>
           <w:szCs w:val="22"/>
         </w:rPr>
+        <w:t xml:space="preserve"> realizados</w:t>
       </w:r>
     </w:p>
     <w:p>
@@ -2861,6 +4053,7 @@
                 <w:rFonts w:ascii="Arial" w:hAnsi="Arial" w:cs="Arial"/>
                 <w:sz w:val="18"/>
               </w:rPr>
+              <w:lastRenderedPageBreak/>
               <w:t xml:space="preserve">| * ba86ec1 </w:t>
             </w:r>
             <w:proofErr w:type="spellStart"/>
@@ -3574,7 +4767,6 @@
                 <w:rFonts w:ascii="Arial" w:hAnsi="Arial" w:cs="Arial"/>
                 <w:sz w:val="18"/>
               </w:rPr>
-              <w:lastRenderedPageBreak/>
               <w:t xml:space="preserve">| |/  </w:t>
             </w:r>
           </w:p>
@@ -4248,6 +5440,69 @@
     </w:p>
     <w:p>
       <w:pPr>
+        <w:rPr>
+          <w:rFonts w:ascii="Arial" w:hAnsi="Arial" w:cs="Arial"/>
+          <w:sz w:val="22"/>
+          <w:szCs w:val="22"/>
+        </w:rPr>
+      </w:pPr>
+    </w:p>
+    <w:p>
+      <w:pPr>
+        <w:rPr>
+          <w:rFonts w:ascii="Arial" w:hAnsi="Arial" w:cs="Arial"/>
+          <w:sz w:val="22"/>
+          <w:szCs w:val="22"/>
+        </w:rPr>
+      </w:pPr>
+    </w:p>
+    <w:p>
+      <w:pPr>
+        <w:rPr>
+          <w:rFonts w:ascii="Arial" w:hAnsi="Arial" w:cs="Arial"/>
+          <w:sz w:val="22"/>
+          <w:szCs w:val="22"/>
+        </w:rPr>
+      </w:pPr>
+    </w:p>
+    <w:p>
+      <w:pPr>
+        <w:rPr>
+          <w:rFonts w:ascii="Arial" w:hAnsi="Arial" w:cs="Arial"/>
+          <w:sz w:val="22"/>
+          <w:szCs w:val="22"/>
+        </w:rPr>
+      </w:pPr>
+    </w:p>
+    <w:p>
+      <w:pPr>
+        <w:rPr>
+          <w:rFonts w:ascii="Arial" w:hAnsi="Arial" w:cs="Arial"/>
+          <w:sz w:val="22"/>
+          <w:szCs w:val="22"/>
+        </w:rPr>
+      </w:pPr>
+    </w:p>
+    <w:p>
+      <w:pPr>
+        <w:rPr>
+          <w:rFonts w:ascii="Arial" w:hAnsi="Arial" w:cs="Arial"/>
+          <w:sz w:val="22"/>
+          <w:szCs w:val="22"/>
+        </w:rPr>
+      </w:pPr>
+    </w:p>
+    <w:p>
+      <w:pPr>
+        <w:rPr>
+          <w:rFonts w:ascii="Arial" w:hAnsi="Arial" w:cs="Arial"/>
+          <w:sz w:val="22"/>
+          <w:szCs w:val="22"/>
+        </w:rPr>
+      </w:pPr>
+    </w:p>
+    <w:p>
+      <w:pPr>
         <w:pStyle w:val="Ttulo1"/>
         <w:rPr>
           <w:rFonts w:ascii="Arial" w:hAnsi="Arial" w:cs="Arial"/>
@@ -4712,32 +5967,6 @@
         </w:rPr>
         <w:t>: resolver conflicto en README.md integrando aportes de ambos integrantes".</w:t>
       </w:r>
-    </w:p>
-    <w:p>
-      <w:pPr>
-        <w:pStyle w:val="Listaconvietas"/>
-        <w:numPr>
-          <w:ilvl w:val="0"/>
-          <w:numId w:val="0"/>
-        </w:numPr>
-        <w:rPr>
-          <w:rFonts w:cs="Arial"/>
-          <w:lang w:val="es-PE"/>
-        </w:rPr>
-      </w:pPr>
-    </w:p>
-    <w:p>
-      <w:pPr>
-        <w:pStyle w:val="Listaconvietas"/>
-        <w:numPr>
-          <w:ilvl w:val="0"/>
-          <w:numId w:val="0"/>
-        </w:numPr>
-        <w:rPr>
-          <w:rFonts w:cs="Arial"/>
-          <w:lang w:val="es-PE"/>
-        </w:rPr>
-      </w:pPr>
     </w:p>
     <w:p>
       <w:pPr>
@@ -5026,6 +6255,111 @@
     </w:p>
     <w:p>
       <w:pPr>
+        <w:rPr>
+          <w:rFonts w:ascii="Arial" w:hAnsi="Arial" w:cs="Arial"/>
+        </w:rPr>
+      </w:pPr>
+    </w:p>
+    <w:p>
+      <w:pPr>
+        <w:rPr>
+          <w:rFonts w:ascii="Arial" w:hAnsi="Arial" w:cs="Arial"/>
+        </w:rPr>
+      </w:pPr>
+    </w:p>
+    <w:p>
+      <w:pPr>
+        <w:rPr>
+          <w:rFonts w:ascii="Arial" w:hAnsi="Arial" w:cs="Arial"/>
+        </w:rPr>
+      </w:pPr>
+    </w:p>
+    <w:p>
+      <w:pPr>
+        <w:rPr>
+          <w:rFonts w:ascii="Arial" w:hAnsi="Arial" w:cs="Arial"/>
+        </w:rPr>
+      </w:pPr>
+    </w:p>
+    <w:p>
+      <w:pPr>
+        <w:rPr>
+          <w:rFonts w:ascii="Arial" w:hAnsi="Arial" w:cs="Arial"/>
+        </w:rPr>
+      </w:pPr>
+    </w:p>
+    <w:p>
+      <w:pPr>
+        <w:rPr>
+          <w:rFonts w:ascii="Arial" w:hAnsi="Arial" w:cs="Arial"/>
+        </w:rPr>
+      </w:pPr>
+    </w:p>
+    <w:p>
+      <w:pPr>
+        <w:rPr>
+          <w:rFonts w:ascii="Arial" w:hAnsi="Arial" w:cs="Arial"/>
+        </w:rPr>
+      </w:pPr>
+    </w:p>
+    <w:p>
+      <w:pPr>
+        <w:rPr>
+          <w:rFonts w:ascii="Arial" w:hAnsi="Arial" w:cs="Arial"/>
+        </w:rPr>
+      </w:pPr>
+    </w:p>
+    <w:p>
+      <w:pPr>
+        <w:rPr>
+          <w:rFonts w:ascii="Arial" w:hAnsi="Arial" w:cs="Arial"/>
+        </w:rPr>
+      </w:pPr>
+    </w:p>
+    <w:p>
+      <w:pPr>
+        <w:rPr>
+          <w:rFonts w:ascii="Arial" w:hAnsi="Arial" w:cs="Arial"/>
+        </w:rPr>
+      </w:pPr>
+    </w:p>
+    <w:p>
+      <w:pPr>
+        <w:rPr>
+          <w:rFonts w:ascii="Arial" w:hAnsi="Arial" w:cs="Arial"/>
+        </w:rPr>
+      </w:pPr>
+    </w:p>
+    <w:p>
+      <w:pPr>
+        <w:rPr>
+          <w:rFonts w:ascii="Arial" w:hAnsi="Arial" w:cs="Arial"/>
+        </w:rPr>
+      </w:pPr>
+    </w:p>
+    <w:p>
+      <w:pPr>
+        <w:rPr>
+          <w:rFonts w:ascii="Arial" w:hAnsi="Arial" w:cs="Arial"/>
+        </w:rPr>
+      </w:pPr>
+    </w:p>
+    <w:p>
+      <w:pPr>
+        <w:rPr>
+          <w:rFonts w:ascii="Arial" w:hAnsi="Arial" w:cs="Arial"/>
+        </w:rPr>
+      </w:pPr>
+    </w:p>
+    <w:p>
+      <w:pPr>
+        <w:rPr>
+          <w:rFonts w:ascii="Arial" w:hAnsi="Arial" w:cs="Arial"/>
+        </w:rPr>
+      </w:pPr>
+    </w:p>
+    <w:p>
+      <w:pPr>
         <w:pStyle w:val="Ttulo1"/>
         <w:rPr>
           <w:rFonts w:ascii="Arial" w:hAnsi="Arial" w:cs="Arial"/>
@@ -5255,1462 +6589,8 @@
     </w:p>
     <w:p>
       <w:pPr>
-        <w:pStyle w:val="Listaconvietas"/>
-        <w:numPr>
-          <w:ilvl w:val="0"/>
-          <w:numId w:val="0"/>
-        </w:numPr>
-        <w:rPr>
-          <w:rFonts w:cs="Arial"/>
-          <w:lang w:val="es-PE"/>
-        </w:rPr>
-      </w:pPr>
-    </w:p>
-    <w:p>
-      <w:pPr>
-        <w:pStyle w:val="Listaconvietas"/>
-        <w:numPr>
-          <w:ilvl w:val="0"/>
-          <w:numId w:val="0"/>
-        </w:numPr>
-        <w:rPr>
-          <w:rFonts w:cs="Arial"/>
-          <w:lang w:val="es-PE"/>
-        </w:rPr>
-      </w:pPr>
-    </w:p>
-    <w:p>
-      <w:pPr>
-        <w:pStyle w:val="Listaconvietas"/>
-        <w:numPr>
-          <w:ilvl w:val="0"/>
-          <w:numId w:val="0"/>
-        </w:numPr>
-        <w:rPr>
-          <w:rFonts w:cs="Arial"/>
-          <w:lang w:val="es-PE"/>
-        </w:rPr>
-      </w:pPr>
-    </w:p>
-    <w:p>
-      <w:pPr>
-        <w:pStyle w:val="Listaconvietas"/>
-        <w:numPr>
-          <w:ilvl w:val="0"/>
-          <w:numId w:val="0"/>
-        </w:numPr>
-        <w:rPr>
-          <w:rFonts w:cs="Arial"/>
-          <w:lang w:val="es-PE"/>
-        </w:rPr>
-      </w:pPr>
-    </w:p>
-    <w:p>
-      <w:pPr>
-        <w:pStyle w:val="Listaconvietas"/>
-        <w:numPr>
-          <w:ilvl w:val="0"/>
-          <w:numId w:val="0"/>
-        </w:numPr>
-        <w:rPr>
-          <w:rFonts w:cs="Arial"/>
-          <w:lang w:val="es-PE"/>
-        </w:rPr>
-      </w:pPr>
-    </w:p>
-    <w:p>
-      <w:pPr>
-        <w:pStyle w:val="Listaconvietas"/>
-        <w:numPr>
-          <w:ilvl w:val="0"/>
-          <w:numId w:val="0"/>
-        </w:numPr>
-        <w:rPr>
-          <w:rFonts w:cs="Arial"/>
-          <w:lang w:val="es-PE"/>
-        </w:rPr>
-      </w:pPr>
-    </w:p>
-    <w:p>
-      <w:pPr>
-        <w:pStyle w:val="Listaconvietas"/>
-        <w:numPr>
-          <w:ilvl w:val="0"/>
-          <w:numId w:val="0"/>
-        </w:numPr>
-        <w:rPr>
-          <w:rFonts w:cs="Arial"/>
-          <w:lang w:val="es-PE"/>
-        </w:rPr>
-      </w:pPr>
-    </w:p>
-    <w:p>
-      <w:pPr>
-        <w:pStyle w:val="Listaconvietas"/>
-        <w:numPr>
-          <w:ilvl w:val="0"/>
-          <w:numId w:val="0"/>
-        </w:numPr>
-        <w:rPr>
-          <w:rFonts w:cs="Arial"/>
-          <w:lang w:val="es-PE"/>
-        </w:rPr>
-      </w:pPr>
-    </w:p>
-    <w:p>
-      <w:pPr>
-        <w:pStyle w:val="Listaconvietas"/>
-        <w:numPr>
-          <w:ilvl w:val="0"/>
-          <w:numId w:val="0"/>
-        </w:numPr>
-        <w:rPr>
-          <w:rFonts w:cs="Arial"/>
-          <w:lang w:val="es-PE"/>
-        </w:rPr>
-      </w:pPr>
-    </w:p>
-    <w:p>
-      <w:pPr>
-        <w:pStyle w:val="Listaconvietas"/>
-        <w:numPr>
-          <w:ilvl w:val="0"/>
-          <w:numId w:val="0"/>
-        </w:numPr>
-        <w:rPr>
-          <w:rFonts w:cs="Arial"/>
-          <w:lang w:val="es-PE"/>
-        </w:rPr>
-      </w:pPr>
-    </w:p>
-    <w:p>
-      <w:pPr>
-        <w:pStyle w:val="Listaconvietas"/>
-        <w:numPr>
-          <w:ilvl w:val="0"/>
-          <w:numId w:val="0"/>
-        </w:numPr>
-        <w:rPr>
-          <w:rFonts w:cs="Arial"/>
-          <w:lang w:val="es-PE"/>
-        </w:rPr>
-      </w:pPr>
-    </w:p>
-    <w:p>
-      <w:pPr>
-        <w:pStyle w:val="Listaconvietas"/>
-        <w:numPr>
-          <w:ilvl w:val="0"/>
-          <w:numId w:val="0"/>
-        </w:numPr>
-        <w:rPr>
-          <w:rFonts w:cs="Arial"/>
-          <w:lang w:val="es-PE"/>
-        </w:rPr>
-      </w:pPr>
-    </w:p>
-    <w:p>
-      <w:pPr>
-        <w:pStyle w:val="Listaconvietas"/>
-        <w:numPr>
-          <w:ilvl w:val="0"/>
-          <w:numId w:val="0"/>
-        </w:numPr>
-        <w:rPr>
-          <w:rFonts w:cs="Arial"/>
-          <w:lang w:val="es-PE"/>
-        </w:rPr>
-      </w:pPr>
-    </w:p>
-    <w:p>
-      <w:pPr>
-        <w:pStyle w:val="Listaconvietas"/>
-        <w:numPr>
-          <w:ilvl w:val="0"/>
-          <w:numId w:val="0"/>
-        </w:numPr>
-        <w:rPr>
-          <w:rFonts w:cs="Arial"/>
-          <w:lang w:val="es-PE"/>
-        </w:rPr>
-      </w:pPr>
-    </w:p>
-    <w:p>
-      <w:pPr>
-        <w:pStyle w:val="Listaconvietas"/>
-        <w:numPr>
-          <w:ilvl w:val="0"/>
-          <w:numId w:val="0"/>
-        </w:numPr>
-        <w:rPr>
-          <w:rFonts w:cs="Arial"/>
-          <w:lang w:val="es-PE"/>
-        </w:rPr>
-      </w:pPr>
-    </w:p>
-    <w:p>
-      <w:pPr>
-        <w:pStyle w:val="Listaconvietas"/>
-        <w:numPr>
-          <w:ilvl w:val="0"/>
-          <w:numId w:val="0"/>
-        </w:numPr>
-        <w:rPr>
-          <w:rFonts w:cs="Arial"/>
-          <w:lang w:val="es-PE"/>
-        </w:rPr>
-      </w:pPr>
-    </w:p>
-    <w:p>
-      <w:pPr>
-        <w:pStyle w:val="Listaconvietas"/>
-        <w:numPr>
-          <w:ilvl w:val="0"/>
-          <w:numId w:val="0"/>
-        </w:numPr>
-        <w:rPr>
-          <w:rFonts w:cs="Arial"/>
-          <w:lang w:val="es-PE"/>
-        </w:rPr>
-      </w:pPr>
-    </w:p>
-    <w:p>
-      <w:pPr>
-        <w:pStyle w:val="Listaconvietas"/>
-        <w:numPr>
-          <w:ilvl w:val="0"/>
-          <w:numId w:val="0"/>
-        </w:numPr>
-        <w:rPr>
-          <w:rFonts w:cs="Arial"/>
-          <w:lang w:val="es-PE"/>
-        </w:rPr>
-      </w:pPr>
-    </w:p>
-    <w:p>
-      <w:pPr>
-        <w:pStyle w:val="Listaconvietas"/>
-        <w:numPr>
-          <w:ilvl w:val="0"/>
-          <w:numId w:val="0"/>
-        </w:numPr>
-        <w:rPr>
-          <w:rFonts w:cs="Arial"/>
-          <w:lang w:val="es-PE"/>
-        </w:rPr>
-      </w:pPr>
-    </w:p>
-    <w:p>
-      <w:pPr>
-        <w:pStyle w:val="Listaconvietas"/>
-        <w:numPr>
-          <w:ilvl w:val="0"/>
-          <w:numId w:val="0"/>
-        </w:numPr>
-        <w:rPr>
-          <w:rFonts w:cs="Arial"/>
-          <w:lang w:val="es-PE"/>
-        </w:rPr>
-      </w:pPr>
-    </w:p>
-    <w:p>
-      <w:pPr>
-        <w:pStyle w:val="Listaconvietas"/>
-        <w:numPr>
-          <w:ilvl w:val="0"/>
-          <w:numId w:val="0"/>
-        </w:numPr>
-        <w:rPr>
-          <w:rFonts w:cs="Arial"/>
-          <w:lang w:val="es-PE"/>
-        </w:rPr>
-      </w:pPr>
-    </w:p>
-    <w:p>
-      <w:pPr>
-        <w:pStyle w:val="Listaconvietas"/>
-        <w:numPr>
-          <w:ilvl w:val="0"/>
-          <w:numId w:val="0"/>
-        </w:numPr>
-        <w:rPr>
-          <w:rFonts w:cs="Arial"/>
-          <w:lang w:val="es-PE"/>
-        </w:rPr>
-      </w:pPr>
-    </w:p>
-    <w:p>
-      <w:pPr>
-        <w:pStyle w:val="Listaconvietas"/>
-        <w:numPr>
-          <w:ilvl w:val="0"/>
-          <w:numId w:val="0"/>
-        </w:numPr>
-        <w:rPr>
-          <w:rFonts w:cs="Arial"/>
-          <w:lang w:val="es-PE"/>
-        </w:rPr>
-      </w:pPr>
-    </w:p>
-    <w:p>
-      <w:pPr>
-        <w:pStyle w:val="Listaconvietas"/>
-        <w:numPr>
-          <w:ilvl w:val="0"/>
-          <w:numId w:val="0"/>
-        </w:numPr>
-        <w:rPr>
-          <w:rFonts w:cs="Arial"/>
-          <w:lang w:val="es-PE"/>
-        </w:rPr>
-      </w:pPr>
-    </w:p>
-    <w:p>
-      <w:pPr>
-        <w:pStyle w:val="Listaconvietas"/>
-        <w:numPr>
-          <w:ilvl w:val="0"/>
-          <w:numId w:val="0"/>
-        </w:numPr>
-        <w:rPr>
-          <w:rFonts w:cs="Arial"/>
-          <w:lang w:val="es-PE"/>
-        </w:rPr>
-      </w:pPr>
-    </w:p>
-    <w:p>
-      <w:pPr>
-        <w:pStyle w:val="Ttulo1"/>
-        <w:rPr>
-          <w:rFonts w:ascii="Arial" w:hAnsi="Arial" w:cs="Arial"/>
-          <w:b/>
-          <w:bCs/>
-          <w:color w:val="auto"/>
-          <w:sz w:val="22"/>
-          <w:szCs w:val="22"/>
-        </w:rPr>
-      </w:pPr>
-      <w:r>
-        <w:rPr>
-          <w:rFonts w:ascii="Arial" w:hAnsi="Arial" w:cs="Arial"/>
-          <w:b/>
-          <w:bCs/>
-          <w:color w:val="auto"/>
-          <w:sz w:val="22"/>
-          <w:szCs w:val="22"/>
-        </w:rPr>
-        <w:t>11. Pasos a seguir por el compañero de equipo</w:t>
-      </w:r>
-    </w:p>
-    <w:p>
-      <w:pPr>
-        <w:pStyle w:val="Ttulo1"/>
-        <w:rPr>
-          <w:rFonts w:ascii="Arial" w:hAnsi="Arial" w:cs="Arial"/>
-          <w:b/>
-          <w:bCs/>
-          <w:color w:val="auto"/>
-          <w:sz w:val="22"/>
-          <w:szCs w:val="22"/>
-        </w:rPr>
-      </w:pPr>
-    </w:p>
-    <w:p>
-      <w:pPr>
-        <w:rPr>
-          <w:rFonts w:ascii="Arial" w:hAnsi="Arial" w:cs="Arial"/>
-          <w:sz w:val="22"/>
-          <w:szCs w:val="22"/>
-        </w:rPr>
-      </w:pPr>
-      <w:r>
-        <w:rPr>
-          <w:rFonts w:ascii="Arial" w:hAnsi="Arial" w:cs="Arial"/>
-          <w:sz w:val="22"/>
-          <w:szCs w:val="22"/>
-        </w:rPr>
-        <w:t>Para incorporarse al repositorio y contribuir siguiendo el mismo flujo de trabajo, el compañero debe:</w:t>
-      </w:r>
-    </w:p>
-    <w:tbl>
-      <w:tblPr>
-        <w:tblW w:w="0" w:type="auto"/>
-        <w:tblLook w:val="04A0" w:firstRow="1" w:lastRow="0" w:firstColumn="1" w:lastColumn="0" w:noHBand="0" w:noVBand="1"/>
-      </w:tblPr>
-      <w:tblGrid>
-        <w:gridCol w:w="8640"/>
-      </w:tblGrid>
-      <w:tr>
-        <w:tc>
-          <w:tcPr>
-            <w:tcW w:w="8640" w:type="dxa"/>
-            <w:shd w:val="clear" w:color="auto" w:fill="F2F2F2"/>
-          </w:tcPr>
-          <w:p>
-            <w:pPr>
-              <w:rPr>
-                <w:rFonts w:ascii="Arial" w:hAnsi="Arial" w:cs="Arial"/>
-              </w:rPr>
-            </w:pPr>
-            <w:r>
-              <w:rPr>
-                <w:rFonts w:ascii="Arial" w:hAnsi="Arial" w:cs="Arial"/>
-                <w:sz w:val="18"/>
-              </w:rPr>
-              <w:t># 1. Clonar el repositorio remoto</w:t>
-            </w:r>
-          </w:p>
-          <w:p>
-            <w:pPr>
-              <w:rPr>
-                <w:rFonts w:ascii="Arial" w:hAnsi="Arial" w:cs="Arial"/>
-              </w:rPr>
-            </w:pPr>
-            <w:proofErr w:type="spellStart"/>
-            <w:r>
-              <w:rPr>
-                <w:rFonts w:ascii="Arial" w:hAnsi="Arial" w:cs="Arial"/>
-                <w:sz w:val="18"/>
-              </w:rPr>
-              <w:t>git</w:t>
-            </w:r>
-            <w:proofErr w:type="spellEnd"/>
-            <w:r>
-              <w:rPr>
-                <w:rFonts w:ascii="Arial" w:hAnsi="Arial" w:cs="Arial"/>
-                <w:sz w:val="18"/>
-              </w:rPr>
-              <w:t xml:space="preserve"> clone https://github.com/U23208480/proyecto-pedidos-equipo01.git</w:t>
-            </w:r>
-          </w:p>
-          <w:p>
-            <w:pPr>
-              <w:rPr>
-                <w:rFonts w:ascii="Arial" w:hAnsi="Arial" w:cs="Arial"/>
-              </w:rPr>
-            </w:pPr>
-            <w:r>
-              <w:rPr>
-                <w:rFonts w:ascii="Arial" w:hAnsi="Arial" w:cs="Arial"/>
-                <w:sz w:val="18"/>
-              </w:rPr>
-              <w:t>cd proyecto-pedidos-equipo01</w:t>
-            </w:r>
-          </w:p>
-          <w:p>
-            <w:pPr>
-              <w:rPr>
-                <w:rFonts w:ascii="Arial" w:hAnsi="Arial" w:cs="Arial"/>
-              </w:rPr>
-            </w:pPr>
-            <w:r>
-              <w:rPr>
-                <w:rFonts w:ascii="Arial" w:hAnsi="Arial" w:cs="Arial"/>
-                <w:sz w:val="18"/>
-              </w:rPr>
-              <w:t xml:space="preserve"> </w:t>
-            </w:r>
-          </w:p>
-          <w:p>
-            <w:pPr>
-              <w:rPr>
-                <w:rFonts w:ascii="Arial" w:hAnsi="Arial" w:cs="Arial"/>
-              </w:rPr>
-            </w:pPr>
-            <w:r>
-              <w:rPr>
-                <w:rFonts w:ascii="Arial" w:hAnsi="Arial" w:cs="Arial"/>
-                <w:sz w:val="18"/>
-              </w:rPr>
-              <w:t># 2. Configurar su identidad en Git (si no lo tiene configurado)</w:t>
-            </w:r>
-          </w:p>
-          <w:p>
-            <w:pPr>
-              <w:rPr>
-                <w:rFonts w:ascii="Arial" w:hAnsi="Arial" w:cs="Arial"/>
-              </w:rPr>
-            </w:pPr>
-            <w:proofErr w:type="spellStart"/>
-            <w:r>
-              <w:rPr>
-                <w:rFonts w:ascii="Arial" w:hAnsi="Arial" w:cs="Arial"/>
-                <w:sz w:val="18"/>
-              </w:rPr>
-              <w:t>git</w:t>
-            </w:r>
-            <w:proofErr w:type="spellEnd"/>
-            <w:r>
-              <w:rPr>
-                <w:rFonts w:ascii="Arial" w:hAnsi="Arial" w:cs="Arial"/>
-                <w:sz w:val="18"/>
-              </w:rPr>
-              <w:t xml:space="preserve"> </w:t>
-            </w:r>
-            <w:proofErr w:type="spellStart"/>
-            <w:r>
-              <w:rPr>
-                <w:rFonts w:ascii="Arial" w:hAnsi="Arial" w:cs="Arial"/>
-                <w:sz w:val="18"/>
-              </w:rPr>
-              <w:t>config</w:t>
-            </w:r>
-            <w:proofErr w:type="spellEnd"/>
-            <w:r>
-              <w:rPr>
-                <w:rFonts w:ascii="Arial" w:hAnsi="Arial" w:cs="Arial"/>
-                <w:sz w:val="18"/>
-              </w:rPr>
-              <w:t xml:space="preserve"> user.name "Nombre Apellido"</w:t>
-            </w:r>
-          </w:p>
-          <w:p>
-            <w:pPr>
-              <w:rPr>
-                <w:rFonts w:ascii="Arial" w:hAnsi="Arial" w:cs="Arial"/>
-                <w:lang w:val="en-US"/>
-              </w:rPr>
-            </w:pPr>
-            <w:r>
-              <w:rPr>
-                <w:rFonts w:ascii="Arial" w:hAnsi="Arial" w:cs="Arial"/>
-                <w:sz w:val="18"/>
-                <w:lang w:val="en-US"/>
-              </w:rPr>
-              <w:t xml:space="preserve">git config </w:t>
-            </w:r>
-            <w:proofErr w:type="spellStart"/>
-            <w:proofErr w:type="gramStart"/>
-            <w:r>
-              <w:rPr>
-                <w:rFonts w:ascii="Arial" w:hAnsi="Arial" w:cs="Arial"/>
-                <w:sz w:val="18"/>
-                <w:lang w:val="en-US"/>
-              </w:rPr>
-              <w:t>user.email</w:t>
-            </w:r>
-            <w:proofErr w:type="spellEnd"/>
-            <w:proofErr w:type="gramEnd"/>
-            <w:r>
-              <w:rPr>
-                <w:rFonts w:ascii="Arial" w:hAnsi="Arial" w:cs="Arial"/>
-                <w:sz w:val="18"/>
-                <w:lang w:val="en-US"/>
-              </w:rPr>
-              <w:t xml:space="preserve"> "correo@ejemplo.com"</w:t>
-            </w:r>
-          </w:p>
-          <w:p>
-            <w:pPr>
-              <w:rPr>
-                <w:rFonts w:ascii="Arial" w:hAnsi="Arial" w:cs="Arial"/>
-                <w:lang w:val="en-US"/>
-              </w:rPr>
-            </w:pPr>
-            <w:r>
-              <w:rPr>
-                <w:rFonts w:ascii="Arial" w:hAnsi="Arial" w:cs="Arial"/>
-                <w:sz w:val="18"/>
-                <w:lang w:val="en-US"/>
-              </w:rPr>
-              <w:t xml:space="preserve"> </w:t>
-            </w:r>
-          </w:p>
-          <w:p>
-            <w:pPr>
-              <w:rPr>
-                <w:rFonts w:ascii="Arial" w:hAnsi="Arial" w:cs="Arial"/>
-              </w:rPr>
-            </w:pPr>
-            <w:r>
-              <w:rPr>
-                <w:rFonts w:ascii="Arial" w:hAnsi="Arial" w:cs="Arial"/>
-                <w:sz w:val="18"/>
-              </w:rPr>
-              <w:t xml:space="preserve"># 3. Cambiar a la rama </w:t>
-            </w:r>
-            <w:proofErr w:type="spellStart"/>
-            <w:r>
-              <w:rPr>
-                <w:rFonts w:ascii="Arial" w:hAnsi="Arial" w:cs="Arial"/>
-                <w:sz w:val="18"/>
-              </w:rPr>
-              <w:t>develop</w:t>
-            </w:r>
-            <w:proofErr w:type="spellEnd"/>
-            <w:r>
-              <w:rPr>
-                <w:rFonts w:ascii="Arial" w:hAnsi="Arial" w:cs="Arial"/>
-                <w:sz w:val="18"/>
-              </w:rPr>
-              <w:t xml:space="preserve"> y actualizarla</w:t>
-            </w:r>
-          </w:p>
-          <w:p>
-            <w:pPr>
-              <w:rPr>
-                <w:rFonts w:ascii="Arial" w:hAnsi="Arial" w:cs="Arial"/>
-                <w:lang w:val="en-US"/>
-              </w:rPr>
-            </w:pPr>
-            <w:r>
-              <w:rPr>
-                <w:rFonts w:ascii="Arial" w:hAnsi="Arial" w:cs="Arial"/>
-                <w:sz w:val="18"/>
-                <w:lang w:val="en-US"/>
-              </w:rPr>
-              <w:t xml:space="preserve">git </w:t>
-            </w:r>
-            <w:proofErr w:type="gramStart"/>
-            <w:r>
-              <w:rPr>
-                <w:rFonts w:ascii="Arial" w:hAnsi="Arial" w:cs="Arial"/>
-                <w:sz w:val="18"/>
-                <w:lang w:val="en-US"/>
-              </w:rPr>
-              <w:t>switch</w:t>
-            </w:r>
-            <w:proofErr w:type="gramEnd"/>
-            <w:r>
-              <w:rPr>
-                <w:rFonts w:ascii="Arial" w:hAnsi="Arial" w:cs="Arial"/>
-                <w:sz w:val="18"/>
-                <w:lang w:val="en-US"/>
-              </w:rPr>
-              <w:t xml:space="preserve"> develop</w:t>
-            </w:r>
-          </w:p>
-          <w:p>
-            <w:pPr>
-              <w:rPr>
-                <w:rFonts w:ascii="Arial" w:hAnsi="Arial" w:cs="Arial"/>
-                <w:lang w:val="en-US"/>
-              </w:rPr>
-            </w:pPr>
-            <w:r>
-              <w:rPr>
-                <w:rFonts w:ascii="Arial" w:hAnsi="Arial" w:cs="Arial"/>
-                <w:sz w:val="18"/>
-                <w:lang w:val="en-US"/>
-              </w:rPr>
-              <w:t>git pull origin develop</w:t>
-            </w:r>
-          </w:p>
-          <w:p>
-            <w:pPr>
-              <w:rPr>
-                <w:rFonts w:ascii="Arial" w:hAnsi="Arial" w:cs="Arial"/>
-                <w:lang w:val="en-US"/>
-              </w:rPr>
-            </w:pPr>
-            <w:r>
-              <w:rPr>
-                <w:rFonts w:ascii="Arial" w:hAnsi="Arial" w:cs="Arial"/>
-                <w:sz w:val="18"/>
-                <w:lang w:val="en-US"/>
-              </w:rPr>
-              <w:t xml:space="preserve"> </w:t>
-            </w:r>
-          </w:p>
-          <w:p>
-            <w:pPr>
-              <w:rPr>
-                <w:rFonts w:ascii="Arial" w:hAnsi="Arial" w:cs="Arial"/>
-              </w:rPr>
-            </w:pPr>
-            <w:r>
-              <w:rPr>
-                <w:rFonts w:ascii="Arial" w:hAnsi="Arial" w:cs="Arial"/>
-                <w:sz w:val="18"/>
-              </w:rPr>
-              <w:t xml:space="preserve"># 4. Crear su propia rama </w:t>
-            </w:r>
-            <w:proofErr w:type="spellStart"/>
-            <w:r>
-              <w:rPr>
-                <w:rFonts w:ascii="Arial" w:hAnsi="Arial" w:cs="Arial"/>
-                <w:sz w:val="18"/>
-              </w:rPr>
-              <w:t>feature</w:t>
-            </w:r>
-            <w:proofErr w:type="spellEnd"/>
-            <w:r>
-              <w:rPr>
-                <w:rFonts w:ascii="Arial" w:hAnsi="Arial" w:cs="Arial"/>
-                <w:sz w:val="18"/>
-              </w:rPr>
-              <w:t xml:space="preserve"> (o retomar una existente)</w:t>
-            </w:r>
-          </w:p>
-          <w:p>
-            <w:pPr>
-              <w:rPr>
-                <w:rFonts w:ascii="Arial" w:hAnsi="Arial" w:cs="Arial"/>
-              </w:rPr>
-            </w:pPr>
-            <w:proofErr w:type="spellStart"/>
-            <w:r>
-              <w:rPr>
-                <w:rFonts w:ascii="Arial" w:hAnsi="Arial" w:cs="Arial"/>
-                <w:sz w:val="18"/>
-              </w:rPr>
-              <w:t>git</w:t>
-            </w:r>
-            <w:proofErr w:type="spellEnd"/>
-            <w:r>
-              <w:rPr>
-                <w:rFonts w:ascii="Arial" w:hAnsi="Arial" w:cs="Arial"/>
-                <w:sz w:val="18"/>
-              </w:rPr>
-              <w:t xml:space="preserve"> switch -c </w:t>
-            </w:r>
-            <w:proofErr w:type="spellStart"/>
-            <w:r>
-              <w:rPr>
-                <w:rFonts w:ascii="Arial" w:hAnsi="Arial" w:cs="Arial"/>
-                <w:sz w:val="18"/>
-              </w:rPr>
-              <w:t>feature</w:t>
-            </w:r>
-            <w:proofErr w:type="spellEnd"/>
-            <w:r>
-              <w:rPr>
-                <w:rFonts w:ascii="Arial" w:hAnsi="Arial" w:cs="Arial"/>
-                <w:sz w:val="18"/>
-              </w:rPr>
-              <w:t>/nueva-funcionalidad</w:t>
-            </w:r>
-          </w:p>
-          <w:p>
-            <w:pPr>
-              <w:rPr>
-                <w:rFonts w:ascii="Arial" w:hAnsi="Arial" w:cs="Arial"/>
-              </w:rPr>
-            </w:pPr>
-            <w:r>
-              <w:rPr>
-                <w:rFonts w:ascii="Arial" w:hAnsi="Arial" w:cs="Arial"/>
-                <w:sz w:val="18"/>
-              </w:rPr>
-              <w:t xml:space="preserve"> </w:t>
-            </w:r>
-          </w:p>
-          <w:p>
-            <w:pPr>
-              <w:rPr>
-                <w:rFonts w:ascii="Arial" w:hAnsi="Arial" w:cs="Arial"/>
-              </w:rPr>
-            </w:pPr>
-            <w:r>
-              <w:rPr>
-                <w:rFonts w:ascii="Arial" w:hAnsi="Arial" w:cs="Arial"/>
-                <w:sz w:val="18"/>
-              </w:rPr>
-              <w:t xml:space="preserve"># 5. Realizar cambios en el código y registrar </w:t>
-            </w:r>
-            <w:proofErr w:type="spellStart"/>
-            <w:r>
-              <w:rPr>
-                <w:rFonts w:ascii="Arial" w:hAnsi="Arial" w:cs="Arial"/>
-                <w:sz w:val="18"/>
-              </w:rPr>
-              <w:t>commits</w:t>
-            </w:r>
-            <w:proofErr w:type="spellEnd"/>
-            <w:r>
-              <w:rPr>
-                <w:rFonts w:ascii="Arial" w:hAnsi="Arial" w:cs="Arial"/>
-                <w:sz w:val="18"/>
-              </w:rPr>
-              <w:t xml:space="preserve"> descriptivos</w:t>
-            </w:r>
-          </w:p>
-          <w:p>
-            <w:pPr>
-              <w:rPr>
-                <w:rFonts w:ascii="Arial" w:hAnsi="Arial" w:cs="Arial"/>
-              </w:rPr>
-            </w:pPr>
-            <w:proofErr w:type="spellStart"/>
-            <w:r>
-              <w:rPr>
-                <w:rFonts w:ascii="Arial" w:hAnsi="Arial" w:cs="Arial"/>
-                <w:sz w:val="18"/>
-              </w:rPr>
-              <w:t>git</w:t>
-            </w:r>
-            <w:proofErr w:type="spellEnd"/>
-            <w:r>
-              <w:rPr>
-                <w:rFonts w:ascii="Arial" w:hAnsi="Arial" w:cs="Arial"/>
-                <w:sz w:val="18"/>
-              </w:rPr>
-              <w:t xml:space="preserve"> </w:t>
-            </w:r>
-            <w:proofErr w:type="spellStart"/>
-            <w:proofErr w:type="gramStart"/>
-            <w:r>
-              <w:rPr>
-                <w:rFonts w:ascii="Arial" w:hAnsi="Arial" w:cs="Arial"/>
-                <w:sz w:val="18"/>
-              </w:rPr>
-              <w:t>add</w:t>
-            </w:r>
-            <w:proofErr w:type="spellEnd"/>
-            <w:r>
-              <w:rPr>
-                <w:rFonts w:ascii="Arial" w:hAnsi="Arial" w:cs="Arial"/>
-                <w:sz w:val="18"/>
-              </w:rPr>
-              <w:t xml:space="preserve"> .</w:t>
-            </w:r>
-            <w:proofErr w:type="gramEnd"/>
-          </w:p>
-          <w:p>
-            <w:pPr>
-              <w:rPr>
-                <w:rFonts w:ascii="Arial" w:hAnsi="Arial" w:cs="Arial"/>
-              </w:rPr>
-            </w:pPr>
-            <w:proofErr w:type="spellStart"/>
-            <w:r>
-              <w:rPr>
-                <w:rFonts w:ascii="Arial" w:hAnsi="Arial" w:cs="Arial"/>
-                <w:sz w:val="18"/>
-              </w:rPr>
-              <w:t>git</w:t>
-            </w:r>
-            <w:proofErr w:type="spellEnd"/>
-            <w:r>
-              <w:rPr>
-                <w:rFonts w:ascii="Arial" w:hAnsi="Arial" w:cs="Arial"/>
-                <w:sz w:val="18"/>
-              </w:rPr>
-              <w:t xml:space="preserve"> </w:t>
-            </w:r>
-            <w:proofErr w:type="spellStart"/>
-            <w:r>
-              <w:rPr>
-                <w:rFonts w:ascii="Arial" w:hAnsi="Arial" w:cs="Arial"/>
-                <w:sz w:val="18"/>
-              </w:rPr>
-              <w:t>commit</w:t>
-            </w:r>
-            <w:proofErr w:type="spellEnd"/>
-            <w:r>
-              <w:rPr>
-                <w:rFonts w:ascii="Arial" w:hAnsi="Arial" w:cs="Arial"/>
-                <w:sz w:val="18"/>
-              </w:rPr>
-              <w:t xml:space="preserve"> -m "</w:t>
-            </w:r>
-            <w:proofErr w:type="spellStart"/>
-            <w:r>
-              <w:rPr>
-                <w:rFonts w:ascii="Arial" w:hAnsi="Arial" w:cs="Arial"/>
-                <w:sz w:val="18"/>
-              </w:rPr>
-              <w:t>feat</w:t>
-            </w:r>
-            <w:proofErr w:type="spellEnd"/>
-            <w:r>
-              <w:rPr>
-                <w:rFonts w:ascii="Arial" w:hAnsi="Arial" w:cs="Arial"/>
-                <w:sz w:val="18"/>
-              </w:rPr>
-              <w:t xml:space="preserve">: </w:t>
-            </w:r>
-            <w:proofErr w:type="spellStart"/>
-            <w:r>
-              <w:rPr>
-                <w:rFonts w:ascii="Arial" w:hAnsi="Arial" w:cs="Arial"/>
-                <w:sz w:val="18"/>
-              </w:rPr>
-              <w:t>descripcion</w:t>
-            </w:r>
-            <w:proofErr w:type="spellEnd"/>
-            <w:r>
-              <w:rPr>
-                <w:rFonts w:ascii="Arial" w:hAnsi="Arial" w:cs="Arial"/>
-                <w:sz w:val="18"/>
-              </w:rPr>
-              <w:t xml:space="preserve"> clara del cambio"</w:t>
-            </w:r>
-          </w:p>
-          <w:p>
-            <w:pPr>
-              <w:rPr>
-                <w:rFonts w:ascii="Arial" w:hAnsi="Arial" w:cs="Arial"/>
-              </w:rPr>
-            </w:pPr>
-            <w:r>
-              <w:rPr>
-                <w:rFonts w:ascii="Arial" w:hAnsi="Arial" w:cs="Arial"/>
-                <w:sz w:val="18"/>
-              </w:rPr>
-              <w:t xml:space="preserve"> </w:t>
-            </w:r>
-          </w:p>
-          <w:p>
-            <w:pPr>
-              <w:rPr>
-                <w:rFonts w:ascii="Arial" w:hAnsi="Arial" w:cs="Arial"/>
-              </w:rPr>
-            </w:pPr>
-            <w:r>
-              <w:rPr>
-                <w:rFonts w:ascii="Arial" w:hAnsi="Arial" w:cs="Arial"/>
-                <w:sz w:val="18"/>
-              </w:rPr>
-              <w:t># 6. Enviar la rama al repositorio remoto</w:t>
-            </w:r>
-          </w:p>
-          <w:p>
-            <w:pPr>
-              <w:rPr>
-                <w:rFonts w:ascii="Arial" w:hAnsi="Arial" w:cs="Arial"/>
-              </w:rPr>
-            </w:pPr>
-            <w:proofErr w:type="spellStart"/>
-            <w:r>
-              <w:rPr>
-                <w:rFonts w:ascii="Arial" w:hAnsi="Arial" w:cs="Arial"/>
-                <w:sz w:val="18"/>
-              </w:rPr>
-              <w:t>git</w:t>
-            </w:r>
-            <w:proofErr w:type="spellEnd"/>
-            <w:r>
-              <w:rPr>
-                <w:rFonts w:ascii="Arial" w:hAnsi="Arial" w:cs="Arial"/>
-                <w:sz w:val="18"/>
-              </w:rPr>
-              <w:t xml:space="preserve"> </w:t>
-            </w:r>
-            <w:proofErr w:type="spellStart"/>
-            <w:r>
-              <w:rPr>
-                <w:rFonts w:ascii="Arial" w:hAnsi="Arial" w:cs="Arial"/>
-                <w:sz w:val="18"/>
-              </w:rPr>
-              <w:t>push</w:t>
-            </w:r>
-            <w:proofErr w:type="spellEnd"/>
-            <w:r>
-              <w:rPr>
-                <w:rFonts w:ascii="Arial" w:hAnsi="Arial" w:cs="Arial"/>
-                <w:sz w:val="18"/>
-              </w:rPr>
-              <w:t xml:space="preserve"> </w:t>
-            </w:r>
-            <w:proofErr w:type="spellStart"/>
-            <w:r>
-              <w:rPr>
-                <w:rFonts w:ascii="Arial" w:hAnsi="Arial" w:cs="Arial"/>
-                <w:sz w:val="18"/>
-              </w:rPr>
-              <w:t>origin</w:t>
-            </w:r>
-            <w:proofErr w:type="spellEnd"/>
-            <w:r>
-              <w:rPr>
-                <w:rFonts w:ascii="Arial" w:hAnsi="Arial" w:cs="Arial"/>
-                <w:sz w:val="18"/>
-              </w:rPr>
-              <w:t xml:space="preserve"> </w:t>
-            </w:r>
-            <w:proofErr w:type="spellStart"/>
-            <w:r>
-              <w:rPr>
-                <w:rFonts w:ascii="Arial" w:hAnsi="Arial" w:cs="Arial"/>
-                <w:sz w:val="18"/>
-              </w:rPr>
-              <w:t>feature</w:t>
-            </w:r>
-            <w:proofErr w:type="spellEnd"/>
-            <w:r>
-              <w:rPr>
-                <w:rFonts w:ascii="Arial" w:hAnsi="Arial" w:cs="Arial"/>
-                <w:sz w:val="18"/>
-              </w:rPr>
-              <w:t>/nueva-funcionalidad</w:t>
-            </w:r>
-          </w:p>
-          <w:p>
-            <w:pPr>
-              <w:rPr>
-                <w:rFonts w:ascii="Arial" w:hAnsi="Arial" w:cs="Arial"/>
-              </w:rPr>
-            </w:pPr>
-            <w:r>
-              <w:rPr>
-                <w:rFonts w:ascii="Arial" w:hAnsi="Arial" w:cs="Arial"/>
-                <w:sz w:val="18"/>
-              </w:rPr>
-              <w:t xml:space="preserve"> </w:t>
-            </w:r>
-          </w:p>
-          <w:p>
-            <w:pPr>
-              <w:rPr>
-                <w:rFonts w:ascii="Arial" w:hAnsi="Arial" w:cs="Arial"/>
-              </w:rPr>
-            </w:pPr>
-            <w:r>
-              <w:rPr>
-                <w:rFonts w:ascii="Arial" w:hAnsi="Arial" w:cs="Arial"/>
-                <w:sz w:val="18"/>
-              </w:rPr>
-              <w:t xml:space="preserve"># 7. Integrar los cambios a </w:t>
-            </w:r>
-            <w:proofErr w:type="spellStart"/>
-            <w:r>
-              <w:rPr>
-                <w:rFonts w:ascii="Arial" w:hAnsi="Arial" w:cs="Arial"/>
-                <w:sz w:val="18"/>
-              </w:rPr>
-              <w:t>develop</w:t>
-            </w:r>
-            <w:proofErr w:type="spellEnd"/>
-            <w:r>
-              <w:rPr>
-                <w:rFonts w:ascii="Arial" w:hAnsi="Arial" w:cs="Arial"/>
-                <w:sz w:val="18"/>
-              </w:rPr>
-              <w:t xml:space="preserve"> (</w:t>
-            </w:r>
-            <w:proofErr w:type="spellStart"/>
-            <w:r>
-              <w:rPr>
-                <w:rFonts w:ascii="Arial" w:hAnsi="Arial" w:cs="Arial"/>
-                <w:sz w:val="18"/>
-              </w:rPr>
-              <w:t>merge</w:t>
-            </w:r>
-            <w:proofErr w:type="spellEnd"/>
-            <w:r>
-              <w:rPr>
-                <w:rFonts w:ascii="Arial" w:hAnsi="Arial" w:cs="Arial"/>
-                <w:sz w:val="18"/>
-              </w:rPr>
-              <w:t xml:space="preserve"> o Pull </w:t>
-            </w:r>
-            <w:proofErr w:type="spellStart"/>
-            <w:r>
-              <w:rPr>
-                <w:rFonts w:ascii="Arial" w:hAnsi="Arial" w:cs="Arial"/>
-                <w:sz w:val="18"/>
-              </w:rPr>
-              <w:t>Request</w:t>
-            </w:r>
-            <w:proofErr w:type="spellEnd"/>
-            <w:r>
-              <w:rPr>
-                <w:rFonts w:ascii="Arial" w:hAnsi="Arial" w:cs="Arial"/>
-                <w:sz w:val="18"/>
-              </w:rPr>
-              <w:t xml:space="preserve"> en GitHub)</w:t>
-            </w:r>
-          </w:p>
-          <w:p>
-            <w:pPr>
-              <w:rPr>
-                <w:rFonts w:ascii="Arial" w:hAnsi="Arial" w:cs="Arial"/>
-                <w:lang w:val="en-US"/>
-              </w:rPr>
-            </w:pPr>
-            <w:r>
-              <w:rPr>
-                <w:rFonts w:ascii="Arial" w:hAnsi="Arial" w:cs="Arial"/>
-                <w:sz w:val="18"/>
-                <w:lang w:val="en-US"/>
-              </w:rPr>
-              <w:t xml:space="preserve">git </w:t>
-            </w:r>
-            <w:proofErr w:type="gramStart"/>
-            <w:r>
-              <w:rPr>
-                <w:rFonts w:ascii="Arial" w:hAnsi="Arial" w:cs="Arial"/>
-                <w:sz w:val="18"/>
-                <w:lang w:val="en-US"/>
-              </w:rPr>
-              <w:t>switch</w:t>
-            </w:r>
-            <w:proofErr w:type="gramEnd"/>
-            <w:r>
-              <w:rPr>
-                <w:rFonts w:ascii="Arial" w:hAnsi="Arial" w:cs="Arial"/>
-                <w:sz w:val="18"/>
-                <w:lang w:val="en-US"/>
-              </w:rPr>
-              <w:t xml:space="preserve"> develop</w:t>
-            </w:r>
-          </w:p>
-          <w:p>
-            <w:pPr>
-              <w:rPr>
-                <w:rFonts w:ascii="Arial" w:hAnsi="Arial" w:cs="Arial"/>
-                <w:lang w:val="en-US"/>
-              </w:rPr>
-            </w:pPr>
-            <w:r>
-              <w:rPr>
-                <w:rFonts w:ascii="Arial" w:hAnsi="Arial" w:cs="Arial"/>
-                <w:sz w:val="18"/>
-                <w:lang w:val="en-US"/>
-              </w:rPr>
-              <w:t>git pull origin develop</w:t>
-            </w:r>
-          </w:p>
-          <w:p>
-            <w:pPr>
-              <w:rPr>
-                <w:rFonts w:ascii="Arial" w:hAnsi="Arial" w:cs="Arial"/>
-              </w:rPr>
-            </w:pPr>
-            <w:proofErr w:type="spellStart"/>
-            <w:r>
-              <w:rPr>
-                <w:rFonts w:ascii="Arial" w:hAnsi="Arial" w:cs="Arial"/>
-                <w:sz w:val="18"/>
-              </w:rPr>
-              <w:t>git</w:t>
-            </w:r>
-            <w:proofErr w:type="spellEnd"/>
-            <w:r>
-              <w:rPr>
-                <w:rFonts w:ascii="Arial" w:hAnsi="Arial" w:cs="Arial"/>
-                <w:sz w:val="18"/>
-              </w:rPr>
-              <w:t xml:space="preserve"> </w:t>
-            </w:r>
-            <w:proofErr w:type="spellStart"/>
-            <w:r>
-              <w:rPr>
-                <w:rFonts w:ascii="Arial" w:hAnsi="Arial" w:cs="Arial"/>
-                <w:sz w:val="18"/>
-              </w:rPr>
-              <w:t>merge</w:t>
-            </w:r>
-            <w:proofErr w:type="spellEnd"/>
-            <w:r>
-              <w:rPr>
-                <w:rFonts w:ascii="Arial" w:hAnsi="Arial" w:cs="Arial"/>
-                <w:sz w:val="18"/>
-              </w:rPr>
-              <w:t xml:space="preserve"> </w:t>
-            </w:r>
-            <w:proofErr w:type="spellStart"/>
-            <w:r>
-              <w:rPr>
-                <w:rFonts w:ascii="Arial" w:hAnsi="Arial" w:cs="Arial"/>
-                <w:sz w:val="18"/>
-              </w:rPr>
-              <w:t>feature</w:t>
-            </w:r>
-            <w:proofErr w:type="spellEnd"/>
-            <w:r>
-              <w:rPr>
-                <w:rFonts w:ascii="Arial" w:hAnsi="Arial" w:cs="Arial"/>
-                <w:sz w:val="18"/>
-              </w:rPr>
-              <w:t>/nueva-funcionalidad --no-</w:t>
-            </w:r>
-            <w:proofErr w:type="spellStart"/>
-            <w:r>
-              <w:rPr>
-                <w:rFonts w:ascii="Arial" w:hAnsi="Arial" w:cs="Arial"/>
-                <w:sz w:val="18"/>
-              </w:rPr>
-              <w:t>ff</w:t>
-            </w:r>
-            <w:proofErr w:type="spellEnd"/>
-          </w:p>
-          <w:p>
-            <w:pPr>
-              <w:rPr>
-                <w:rFonts w:ascii="Arial" w:hAnsi="Arial" w:cs="Arial"/>
-              </w:rPr>
-            </w:pPr>
-            <w:proofErr w:type="spellStart"/>
-            <w:r>
-              <w:rPr>
-                <w:rFonts w:ascii="Arial" w:hAnsi="Arial" w:cs="Arial"/>
-                <w:sz w:val="18"/>
-              </w:rPr>
-              <w:t>git</w:t>
-            </w:r>
-            <w:proofErr w:type="spellEnd"/>
-            <w:r>
-              <w:rPr>
-                <w:rFonts w:ascii="Arial" w:hAnsi="Arial" w:cs="Arial"/>
-                <w:sz w:val="18"/>
-              </w:rPr>
-              <w:t xml:space="preserve"> </w:t>
-            </w:r>
-            <w:proofErr w:type="spellStart"/>
-            <w:r>
-              <w:rPr>
-                <w:rFonts w:ascii="Arial" w:hAnsi="Arial" w:cs="Arial"/>
-                <w:sz w:val="18"/>
-              </w:rPr>
-              <w:t>push</w:t>
-            </w:r>
-            <w:proofErr w:type="spellEnd"/>
-            <w:r>
-              <w:rPr>
-                <w:rFonts w:ascii="Arial" w:hAnsi="Arial" w:cs="Arial"/>
-                <w:sz w:val="18"/>
-              </w:rPr>
-              <w:t xml:space="preserve"> </w:t>
-            </w:r>
-            <w:proofErr w:type="spellStart"/>
-            <w:r>
-              <w:rPr>
-                <w:rFonts w:ascii="Arial" w:hAnsi="Arial" w:cs="Arial"/>
-                <w:sz w:val="18"/>
-              </w:rPr>
-              <w:t>origin</w:t>
-            </w:r>
-            <w:proofErr w:type="spellEnd"/>
-            <w:r>
-              <w:rPr>
-                <w:rFonts w:ascii="Arial" w:hAnsi="Arial" w:cs="Arial"/>
-                <w:sz w:val="18"/>
-              </w:rPr>
-              <w:t xml:space="preserve"> </w:t>
-            </w:r>
-            <w:proofErr w:type="spellStart"/>
-            <w:r>
-              <w:rPr>
-                <w:rFonts w:ascii="Arial" w:hAnsi="Arial" w:cs="Arial"/>
-                <w:sz w:val="18"/>
-              </w:rPr>
-              <w:t>develop</w:t>
-            </w:r>
-            <w:proofErr w:type="spellEnd"/>
-          </w:p>
-          <w:p>
-            <w:pPr>
-              <w:rPr>
-                <w:rFonts w:ascii="Arial" w:hAnsi="Arial" w:cs="Arial"/>
-              </w:rPr>
-            </w:pPr>
-            <w:r>
-              <w:rPr>
-                <w:rFonts w:ascii="Arial" w:hAnsi="Arial" w:cs="Arial"/>
-                <w:sz w:val="18"/>
-              </w:rPr>
-              <w:t xml:space="preserve"> </w:t>
-            </w:r>
-          </w:p>
-          <w:p>
-            <w:pPr>
-              <w:rPr>
-                <w:rFonts w:ascii="Arial" w:hAnsi="Arial" w:cs="Arial"/>
-              </w:rPr>
-            </w:pPr>
-            <w:r>
-              <w:rPr>
-                <w:rFonts w:ascii="Arial" w:hAnsi="Arial" w:cs="Arial"/>
-                <w:sz w:val="18"/>
-              </w:rPr>
-              <w:t># 8. Si aparece un conflicto, resolverlo manualmente en los archivos</w:t>
-            </w:r>
-          </w:p>
-          <w:p>
-            <w:pPr>
-              <w:rPr>
-                <w:rFonts w:ascii="Arial" w:hAnsi="Arial" w:cs="Arial"/>
-              </w:rPr>
-            </w:pPr>
-            <w:r>
-              <w:rPr>
-                <w:rFonts w:ascii="Arial" w:hAnsi="Arial" w:cs="Arial"/>
-                <w:sz w:val="18"/>
-              </w:rPr>
-              <w:t>#    marcados, luego:</w:t>
-            </w:r>
-          </w:p>
-          <w:p>
-            <w:pPr>
-              <w:rPr>
-                <w:rFonts w:ascii="Arial" w:hAnsi="Arial" w:cs="Arial"/>
-              </w:rPr>
-            </w:pPr>
-            <w:proofErr w:type="spellStart"/>
-            <w:r>
-              <w:rPr>
-                <w:rFonts w:ascii="Arial" w:hAnsi="Arial" w:cs="Arial"/>
-                <w:sz w:val="18"/>
-              </w:rPr>
-              <w:t>git</w:t>
-            </w:r>
-            <w:proofErr w:type="spellEnd"/>
-            <w:r>
-              <w:rPr>
-                <w:rFonts w:ascii="Arial" w:hAnsi="Arial" w:cs="Arial"/>
-                <w:sz w:val="18"/>
-              </w:rPr>
-              <w:t xml:space="preserve"> </w:t>
-            </w:r>
-            <w:proofErr w:type="spellStart"/>
-            <w:r>
-              <w:rPr>
-                <w:rFonts w:ascii="Arial" w:hAnsi="Arial" w:cs="Arial"/>
-                <w:sz w:val="18"/>
-              </w:rPr>
-              <w:t>add</w:t>
-            </w:r>
-            <w:proofErr w:type="spellEnd"/>
-            <w:r>
-              <w:rPr>
-                <w:rFonts w:ascii="Arial" w:hAnsi="Arial" w:cs="Arial"/>
-                <w:sz w:val="18"/>
-              </w:rPr>
-              <w:t xml:space="preserve"> &lt;archivo-resuelto&gt;</w:t>
-            </w:r>
-          </w:p>
-          <w:p>
-            <w:pPr>
-              <w:rPr>
-                <w:rFonts w:ascii="Arial" w:hAnsi="Arial" w:cs="Arial"/>
-              </w:rPr>
-            </w:pPr>
-            <w:proofErr w:type="spellStart"/>
-            <w:r>
-              <w:rPr>
-                <w:rFonts w:ascii="Arial" w:hAnsi="Arial" w:cs="Arial"/>
-                <w:sz w:val="18"/>
-              </w:rPr>
-              <w:t>git</w:t>
-            </w:r>
-            <w:proofErr w:type="spellEnd"/>
-            <w:r>
-              <w:rPr>
-                <w:rFonts w:ascii="Arial" w:hAnsi="Arial" w:cs="Arial"/>
-                <w:sz w:val="18"/>
-              </w:rPr>
-              <w:t xml:space="preserve"> </w:t>
-            </w:r>
-            <w:proofErr w:type="spellStart"/>
-            <w:r>
-              <w:rPr>
-                <w:rFonts w:ascii="Arial" w:hAnsi="Arial" w:cs="Arial"/>
-                <w:sz w:val="18"/>
-              </w:rPr>
-              <w:t>commit</w:t>
-            </w:r>
-            <w:proofErr w:type="spellEnd"/>
-          </w:p>
-        </w:tc>
-      </w:tr>
-    </w:tbl>
-    <w:p>
-      <w:pPr>
-        <w:rPr>
-          <w:rFonts w:ascii="Arial" w:hAnsi="Arial" w:cs="Arial"/>
-        </w:rPr>
-      </w:pPr>
-    </w:p>
-    <w:p>
-      <w:pPr>
         <w:spacing w:after="40"/>
-        <w:jc w:val="center"/>
-      </w:pPr>
-      <w:r>
-        <w:rPr>
-          <w:rFonts w:ascii="Arial" w:hAnsi="Arial" w:cs="Arial"/>
-        </w:rPr>
-        <w:t xml:space="preserve">Se recomienda que el compañero trabaje siempre sobre una rama </w:t>
-      </w:r>
-      <w:proofErr w:type="spellStart"/>
-      <w:r>
-        <w:rPr>
-          <w:rFonts w:ascii="Arial" w:hAnsi="Arial" w:cs="Arial"/>
-        </w:rPr>
-        <w:t>feature</w:t>
-      </w:r>
-      <w:proofErr w:type="spellEnd"/>
-      <w:r>
-        <w:rPr>
-          <w:rFonts w:ascii="Arial" w:hAnsi="Arial" w:cs="Arial"/>
-        </w:rPr>
-        <w:t xml:space="preserve"> propia, evite hacer </w:t>
-      </w:r>
-      <w:proofErr w:type="spellStart"/>
-      <w:r>
-        <w:rPr>
-          <w:rFonts w:ascii="Arial" w:hAnsi="Arial" w:cs="Arial"/>
-        </w:rPr>
-        <w:t>commits</w:t>
-      </w:r>
-      <w:proofErr w:type="spellEnd"/>
-      <w:r>
-        <w:rPr>
-          <w:rFonts w:ascii="Arial" w:hAnsi="Arial" w:cs="Arial"/>
-        </w:rPr>
-        <w:t xml:space="preserve"> directamente sobre </w:t>
-      </w:r>
-      <w:proofErr w:type="spellStart"/>
-      <w:r>
-        <w:rPr>
-          <w:rFonts w:ascii="Arial" w:hAnsi="Arial" w:cs="Arial"/>
-        </w:rPr>
-        <w:t>main</w:t>
-      </w:r>
-      <w:proofErr w:type="spellEnd"/>
-      <w:r>
-        <w:rPr>
-          <w:rFonts w:ascii="Arial" w:hAnsi="Arial" w:cs="Arial"/>
-        </w:rPr>
-        <w:t xml:space="preserve"> o </w:t>
-      </w:r>
-      <w:proofErr w:type="spellStart"/>
-      <w:r>
-        <w:rPr>
-          <w:rFonts w:ascii="Arial" w:hAnsi="Arial" w:cs="Arial"/>
-        </w:rPr>
-        <w:t>develop</w:t>
-      </w:r>
-      <w:proofErr w:type="spellEnd"/>
-      <w:r>
-        <w:rPr>
-          <w:rFonts w:ascii="Arial" w:hAnsi="Arial" w:cs="Arial"/>
-        </w:rPr>
-        <w:t xml:space="preserve">, y sincronice su rama con </w:t>
-      </w:r>
-      <w:proofErr w:type="spellStart"/>
-      <w:r>
-        <w:rPr>
-          <w:rFonts w:ascii="Arial" w:hAnsi="Arial" w:cs="Arial"/>
-        </w:rPr>
-        <w:t>git</w:t>
-      </w:r>
-      <w:proofErr w:type="spellEnd"/>
-      <w:r>
-        <w:rPr>
-          <w:rFonts w:ascii="Arial" w:hAnsi="Arial" w:cs="Arial"/>
-        </w:rPr>
-        <w:t xml:space="preserve"> </w:t>
-      </w:r>
-      <w:proofErr w:type="spellStart"/>
-      <w:r>
-        <w:rPr>
-          <w:rFonts w:ascii="Arial" w:hAnsi="Arial" w:cs="Arial"/>
-        </w:rPr>
-        <w:t>pull</w:t>
-      </w:r>
-      <w:proofErr w:type="spellEnd"/>
-      <w:r>
-        <w:rPr>
-          <w:rFonts w:ascii="Arial" w:hAnsi="Arial" w:cs="Arial"/>
-        </w:rPr>
-        <w:t xml:space="preserve"> antes de iniciar cada sesión de trabajo para minimizar</w:t>
-      </w:r>
-      <w:r>
-        <w:t xml:space="preserve"> conflictos.</w:t>
-      </w:r>
+      </w:pPr>
     </w:p>
     <w:sectPr>
       <w:headerReference w:type="default" r:id="rId9"/>

</xml_diff>